<commit_message>
docs: add tap-boundaries diagram to the design doc (HTML + Word)
New Figure 4 in section 4 (Production integration): the four tap
boundaries — Model (SDK wrapper / LiteLLM egress proxy), Tool (MCP
gateway → OTel), Telemetry (OTel ingester), and the deferred Agent
(A2A) — with, for each, the collector, the scenario it applies to, and
its tool-call fidelity (FULL / PARTIAL / CONDITIONAL / DEFERRED).

- aprntc-design.html: inline SVG + a new "Tap boundaries" subsection.
- aprntc-design.docx: same figure embedded as a rendered PNG, plus a
  companion table; validated, 4 images embedded.
- assets/fig4-taps.png.

Co-Authored-By: Claude Opus 4.8 <noreply@anthropic.com>
</commit_message>
<xml_diff>
--- a/docs/design/aprntc-design.docx
+++ b/docs/design/aprntc-design.docx
@@ -5,7 +5,6 @@
     <w:p>
       <w:pPr>
         <w:spacing w:before="1200" w:after="0"/>
-        <w:jc w:val="left"/>
       </w:pPr>
       <w:r>
         <w:rPr>
@@ -99,7 +98,7 @@
           <w:szCs w:val="20"/>
           <w:rFonts w:ascii="Arial" w:cs="Arial" w:eastAsia="Arial" w:hAnsi="Arial"/>
         </w:rPr>
-        <w:t xml:space="preserve">Generated:  2026-06-14</w:t>
+        <w:t xml:space="preserve">Generated:  2026-06-17</w:t>
       </w:r>
     </w:p>
     <w:p>
@@ -1513,6 +1512,964 @@
         <w:t xml:space="preserve">Initial G0 = the customer registers their current system prompt (aprntc needs only the prompt text, not the code); if they don’t, aprntc infers an approximate G0 from the system prompt the tap observed.</w:t>
       </w:r>
     </w:p>
+    <w:p>
+      <w:pPr>
+        <w:pStyle w:val="Heading2"/>
+      </w:pPr>
+      <w:r>
+        <w:rPr>
+          <w:rFonts w:ascii="Arial" w:cs="Arial" w:eastAsia="Arial" w:hAnsi="Arial"/>
+        </w:rPr>
+        <w:t xml:space="preserve">Tap boundaries — which collector, which scenario</w:t>
+      </w:r>
+    </w:p>
+    <w:p>
+      <w:pPr>
+        <w:spacing w:after="120" w:line="276"/>
+      </w:pPr>
+      <w:r>
+        <w:rPr>
+          <w:color w:val="1A1A22"/>
+          <w:sz w:val="21"/>
+          <w:szCs w:val="21"/>
+          <w:rFonts w:ascii="Arial" w:cs="Arial" w:eastAsia="Arial" w:hAnsi="Arial"/>
+        </w:rPr>
+        <w:t xml:space="preserve">The inbound tap isn’t one integration; it’s a set of </w:t>
+      </w:r>
+      <w:r>
+        <w:rPr>
+          <w:b/>
+          <w:bCs/>
+          <w:color w:val="1A1A22"/>
+          <w:sz w:val="21"/>
+          <w:szCs w:val="21"/>
+          <w:rFonts w:ascii="Arial" w:cs="Arial" w:eastAsia="Arial" w:hAnsi="Arial"/>
+        </w:rPr>
+        <w:t xml:space="preserve">collectors at stable protocol boundaries</w:t>
+      </w:r>
+      <w:r>
+        <w:rPr>
+          <w:color w:val="1A1A22"/>
+          <w:sz w:val="21"/>
+          <w:szCs w:val="21"/>
+          <w:rFonts w:ascii="Arial" w:cs="Arial" w:eastAsia="Arial" w:hAnsi="Arial"/>
+        </w:rPr>
+        <w:t xml:space="preserve">. You attach at whichever boundary your agent already exposes — no framework lock-in. Each collector normalizes into the </w:t>
+      </w:r>
+      <w:r>
+        <w:rPr>
+          <w:i/>
+          <w:iCs/>
+          <w:color w:val="1A1A22"/>
+          <w:sz w:val="21"/>
+          <w:szCs w:val="21"/>
+          <w:rFonts w:ascii="Arial" w:cs="Arial" w:eastAsia="Arial" w:hAnsi="Arial"/>
+        </w:rPr>
+        <w:t xml:space="preserve">same</w:t>
+      </w:r>
+      <w:r>
+        <w:rPr>
+          <w:color w:val="1A1A22"/>
+          <w:sz w:val="21"/>
+          <w:szCs w:val="21"/>
+          <w:rFonts w:ascii="Arial" w:cs="Arial" w:eastAsia="Arial" w:hAnsi="Arial"/>
+        </w:rPr>
+        <w:t xml:space="preserve"> canonical Trajectory, and fidelity degrades gracefully by how the target was built: an agent we own gives full tool tracking; a closed-source agent behind the proxy still gives us model traffic.</w:t>
+      </w:r>
+    </w:p>
+    <w:p>
+      <w:pPr>
+        <w:spacing w:before="120" w:after="60"/>
+        <w:jc w:val="center"/>
+      </w:pPr>
+      <w:r>
+        <w:drawing>
+          <wp:inline distT="0" distB="0" distL="0" distR="0">
+            <wp:extent cx="6172200" cy="3686175"/>
+            <wp:effectExtent t="0" r="0" b="0" l="0"/>
+            <wp:docPr id="1" name="fig4-taps.png" descr="Figure 4 — The four tap boundaries, the collector at each, the scenario it fits, and how complete its tool-call capture is. A2A is the deferred fifth boundary." title="Figure 4 — The four tap boundaries, the collector at each, the scenario it fits, and how complete its tool-call capture is. A2A is the deferred fifth boundary."/>
+            <wp:cNvGraphicFramePr>
+              <a:graphicFrameLocks xmlns:a="http://schemas.openxmlformats.org/drawingml/2006/main" noChangeAspect="1"/>
+            </wp:cNvGraphicFramePr>
+            <a:graphic xmlns:a="http://schemas.openxmlformats.org/drawingml/2006/main">
+              <a:graphicData uri="http://schemas.openxmlformats.org/drawingml/2006/picture">
+                <pic:pic xmlns:pic="http://schemas.openxmlformats.org/drawingml/2006/picture">
+                  <pic:nvPicPr>
+                    <pic:cNvPr id="0" name="" descr=""/>
+                    <pic:cNvPicPr>
+                      <a:picLocks noChangeAspect="1" noChangeArrowheads="1"/>
+                    </pic:cNvPicPr>
+                  </pic:nvPicPr>
+                  <pic:blipFill>
+                    <a:blip r:embed="rId9" cstate="none"/>
+                    <a:srcRect/>
+                    <a:stretch>
+                      <a:fillRect/>
+                    </a:stretch>
+                  </pic:blipFill>
+                  <pic:spPr bwMode="auto">
+                    <a:xfrm>
+                      <a:off x="0" y="0"/>
+                      <a:ext cx="6172200" cy="3686175"/>
+                    </a:xfrm>
+                    <a:prstGeom prst="rect">
+                      <a:avLst/>
+                    </a:prstGeom>
+                  </pic:spPr>
+                </pic:pic>
+              </a:graphicData>
+            </a:graphic>
+          </wp:inline>
+        </w:drawing>
+      </w:r>
+    </w:p>
+    <w:p>
+      <w:pPr>
+        <w:spacing w:after="200"/>
+        <w:jc w:val="center"/>
+      </w:pPr>
+      <w:r>
+        <w:rPr>
+          <w:i/>
+          <w:iCs/>
+          <w:color w:val="8A8A95"/>
+          <w:sz w:val="17"/>
+          <w:szCs w:val="17"/>
+          <w:rFonts w:ascii="Arial" w:cs="Arial" w:eastAsia="Arial" w:hAnsi="Arial"/>
+        </w:rPr>
+        <w:t xml:space="preserve">Figure 4 — The four tap boundaries, the collector at each, the scenario it fits, and how complete its tool-call capture is. A2A is the deferred fifth boundary.</w:t>
+      </w:r>
+    </w:p>
+    <w:tbl>
+      <w:tblPr>
+        <w:tblW w:type="dxa" w:w="9360"/>
+        <w:tblBorders>
+          <w:top w:val="single" w:color="auto" w:sz="4"/>
+          <w:left w:val="single" w:color="auto" w:sz="4"/>
+          <w:bottom w:val="single" w:color="auto" w:sz="4"/>
+          <w:right w:val="single" w:color="auto" w:sz="4"/>
+          <w:insideH w:val="single" w:color="auto" w:sz="4"/>
+          <w:insideV w:val="single" w:color="auto" w:sz="4"/>
+        </w:tblBorders>
+      </w:tblPr>
+      <w:tblGrid>
+        <w:gridCol w:w="1760"/>
+        <w:gridCol w:w="1760"/>
+        <w:gridCol w:w="4040"/>
+        <w:gridCol w:w="1800"/>
+      </w:tblGrid>
+      <w:tr>
+        <w:trPr>
+          <w:tblHeader/>
+        </w:trPr>
+        <w:tc>
+          <w:tcPr>
+            <w:tcW w:type="dxa" w:w="1760"/>
+            <w:tcBorders>
+              <w:top w:val="single" w:color="D9D9E0" w:sz="1"/>
+              <w:left w:val="single" w:color="D9D9E0" w:sz="1"/>
+              <w:bottom w:val="single" w:color="D9D9E0" w:sz="1"/>
+              <w:right w:val="single" w:color="D9D9E0" w:sz="1"/>
+            </w:tcBorders>
+            <w:shd w:fill="EEF0FB" w:val="clear"/>
+            <w:tcMar>
+              <w:top w:type="dxa" w:w="60"/>
+              <w:left w:type="dxa" w:w="120"/>
+              <w:bottom w:type="dxa" w:w="60"/>
+              <w:right w:type="dxa" w:w="120"/>
+            </w:tcMar>
+          </w:tcPr>
+          <w:p>
+            <w:pPr>
+              <w:spacing w:after="0" w:line="252"/>
+            </w:pPr>
+            <w:r>
+              <w:rPr>
+                <w:b/>
+                <w:bCs/>
+                <w:color w:val="1A1A22"/>
+                <w:sz w:val="18"/>
+                <w:szCs w:val="18"/>
+                <w:rFonts w:ascii="Arial" w:cs="Arial" w:eastAsia="Arial" w:hAnsi="Arial"/>
+              </w:rPr>
+              <w:t xml:space="preserve">Boundary</w:t>
+            </w:r>
+          </w:p>
+        </w:tc>
+        <w:tc>
+          <w:tcPr>
+            <w:tcW w:type="dxa" w:w="1760"/>
+            <w:tcBorders>
+              <w:top w:val="single" w:color="D9D9E0" w:sz="1"/>
+              <w:left w:val="single" w:color="D9D9E0" w:sz="1"/>
+              <w:bottom w:val="single" w:color="D9D9E0" w:sz="1"/>
+              <w:right w:val="single" w:color="D9D9E0" w:sz="1"/>
+            </w:tcBorders>
+            <w:shd w:fill="EEF0FB" w:val="clear"/>
+            <w:tcMar>
+              <w:top w:type="dxa" w:w="60"/>
+              <w:left w:type="dxa" w:w="120"/>
+              <w:bottom w:type="dxa" w:w="60"/>
+              <w:right w:type="dxa" w:w="120"/>
+            </w:tcMar>
+          </w:tcPr>
+          <w:p>
+            <w:pPr>
+              <w:spacing w:after="0" w:line="252"/>
+            </w:pPr>
+            <w:r>
+              <w:rPr>
+                <w:b/>
+                <w:bCs/>
+                <w:color w:val="1A1A22"/>
+                <w:sz w:val="18"/>
+                <w:szCs w:val="18"/>
+                <w:rFonts w:ascii="Arial" w:cs="Arial" w:eastAsia="Arial" w:hAnsi="Arial"/>
+              </w:rPr>
+              <w:t xml:space="preserve">Collector</w:t>
+            </w:r>
+          </w:p>
+        </w:tc>
+        <w:tc>
+          <w:tcPr>
+            <w:tcW w:type="dxa" w:w="4040"/>
+            <w:tcBorders>
+              <w:top w:val="single" w:color="D9D9E0" w:sz="1"/>
+              <w:left w:val="single" w:color="D9D9E0" w:sz="1"/>
+              <w:bottom w:val="single" w:color="D9D9E0" w:sz="1"/>
+              <w:right w:val="single" w:color="D9D9E0" w:sz="1"/>
+            </w:tcBorders>
+            <w:shd w:fill="EEF0FB" w:val="clear"/>
+            <w:tcMar>
+              <w:top w:type="dxa" w:w="60"/>
+              <w:left w:type="dxa" w:w="120"/>
+              <w:bottom w:type="dxa" w:w="60"/>
+              <w:right w:type="dxa" w:w="120"/>
+            </w:tcMar>
+          </w:tcPr>
+          <w:p>
+            <w:pPr>
+              <w:spacing w:after="0" w:line="252"/>
+            </w:pPr>
+            <w:r>
+              <w:rPr>
+                <w:b/>
+                <w:bCs/>
+                <w:color w:val="1A1A22"/>
+                <w:sz w:val="18"/>
+                <w:szCs w:val="18"/>
+                <w:rFonts w:ascii="Arial" w:cs="Arial" w:eastAsia="Arial" w:hAnsi="Arial"/>
+              </w:rPr>
+              <w:t xml:space="preserve">When it applies</w:t>
+            </w:r>
+          </w:p>
+        </w:tc>
+        <w:tc>
+          <w:tcPr>
+            <w:tcW w:type="dxa" w:w="1800"/>
+            <w:tcBorders>
+              <w:top w:val="single" w:color="D9D9E0" w:sz="1"/>
+              <w:left w:val="single" w:color="D9D9E0" w:sz="1"/>
+              <w:bottom w:val="single" w:color="D9D9E0" w:sz="1"/>
+              <w:right w:val="single" w:color="D9D9E0" w:sz="1"/>
+            </w:tcBorders>
+            <w:shd w:fill="EEF0FB" w:val="clear"/>
+            <w:tcMar>
+              <w:top w:type="dxa" w:w="60"/>
+              <w:left w:type="dxa" w:w="120"/>
+              <w:bottom w:type="dxa" w:w="60"/>
+              <w:right w:type="dxa" w:w="120"/>
+            </w:tcMar>
+          </w:tcPr>
+          <w:p>
+            <w:pPr>
+              <w:spacing w:after="0" w:line="252"/>
+            </w:pPr>
+            <w:r>
+              <w:rPr>
+                <w:b/>
+                <w:bCs/>
+                <w:color w:val="1A1A22"/>
+                <w:sz w:val="18"/>
+                <w:szCs w:val="18"/>
+                <w:rFonts w:ascii="Arial" w:cs="Arial" w:eastAsia="Arial" w:hAnsi="Arial"/>
+              </w:rPr>
+              <w:t xml:space="preserve">Tool fidelity</w:t>
+            </w:r>
+          </w:p>
+        </w:tc>
+      </w:tr>
+      <w:tr>
+        <w:tc>
+          <w:tcPr>
+            <w:tcW w:type="dxa" w:w="1760"/>
+            <w:tcBorders>
+              <w:top w:val="single" w:color="D9D9E0" w:sz="1"/>
+              <w:left w:val="single" w:color="D9D9E0" w:sz="1"/>
+              <w:bottom w:val="single" w:color="D9D9E0" w:sz="1"/>
+              <w:right w:val="single" w:color="D9D9E0" w:sz="1"/>
+            </w:tcBorders>
+            <w:tcMar>
+              <w:top w:type="dxa" w:w="60"/>
+              <w:left w:type="dxa" w:w="120"/>
+              <w:bottom w:type="dxa" w:w="60"/>
+              <w:right w:type="dxa" w:w="120"/>
+            </w:tcMar>
+          </w:tcPr>
+          <w:p>
+            <w:pPr>
+              <w:spacing w:after="0" w:line="252"/>
+            </w:pPr>
+            <w:r>
+              <w:rPr>
+                <w:b w:val="false"/>
+                <w:bCs w:val="false"/>
+                <w:color w:val="1A1A22"/>
+                <w:sz w:val="18"/>
+                <w:szCs w:val="18"/>
+                <w:rFonts w:ascii="Arial" w:cs="Arial" w:eastAsia="Arial" w:hAnsi="Arial"/>
+              </w:rPr>
+              <w:t xml:space="preserve">Model (LLM API)</w:t>
+            </w:r>
+          </w:p>
+        </w:tc>
+        <w:tc>
+          <w:tcPr>
+            <w:tcW w:type="dxa" w:w="1760"/>
+            <w:tcBorders>
+              <w:top w:val="single" w:color="D9D9E0" w:sz="1"/>
+              <w:left w:val="single" w:color="D9D9E0" w:sz="1"/>
+              <w:bottom w:val="single" w:color="D9D9E0" w:sz="1"/>
+              <w:right w:val="single" w:color="D9D9E0" w:sz="1"/>
+            </w:tcBorders>
+            <w:tcMar>
+              <w:top w:type="dxa" w:w="60"/>
+              <w:left w:type="dxa" w:w="120"/>
+              <w:bottom w:type="dxa" w:w="60"/>
+              <w:right w:type="dxa" w:w="120"/>
+            </w:tcMar>
+          </w:tcPr>
+          <w:p>
+            <w:pPr>
+              <w:spacing w:after="0" w:line="252"/>
+            </w:pPr>
+            <w:r>
+              <w:rPr>
+                <w:b w:val="false"/>
+                <w:bCs w:val="false"/>
+                <w:color w:val="1A1A22"/>
+                <w:sz w:val="18"/>
+                <w:szCs w:val="18"/>
+                <w:rFonts w:ascii="Arial" w:cs="Arial" w:eastAsia="Arial" w:hAnsi="Arial"/>
+              </w:rPr>
+              <w:t xml:space="preserve">SDK wrapper</w:t>
+            </w:r>
+          </w:p>
+        </w:tc>
+        <w:tc>
+          <w:tcPr>
+            <w:tcW w:type="dxa" w:w="4040"/>
+            <w:tcBorders>
+              <w:top w:val="single" w:color="D9D9E0" w:sz="1"/>
+              <w:left w:val="single" w:color="D9D9E0" w:sz="1"/>
+              <w:bottom w:val="single" w:color="D9D9E0" w:sz="1"/>
+              <w:right w:val="single" w:color="D9D9E0" w:sz="1"/>
+            </w:tcBorders>
+            <w:tcMar>
+              <w:top w:type="dxa" w:w="60"/>
+              <w:left w:type="dxa" w:w="120"/>
+              <w:bottom w:type="dxa" w:w="60"/>
+              <w:right w:type="dxa" w:w="120"/>
+            </w:tcMar>
+          </w:tcPr>
+          <w:p>
+            <w:pPr>
+              <w:spacing w:after="0" w:line="252"/>
+            </w:pPr>
+            <w:r>
+              <w:rPr>
+                <w:b w:val="false"/>
+                <w:bCs w:val="false"/>
+                <w:color w:val="1A1A22"/>
+                <w:sz w:val="18"/>
+                <w:szCs w:val="18"/>
+                <w:rFonts w:ascii="Arial" w:cs="Arial" w:eastAsia="Arial" w:hAnsi="Arial"/>
+              </w:rPr>
+              <w:t xml:space="preserve">Agents whose code you own (our two demos).</w:t>
+            </w:r>
+          </w:p>
+        </w:tc>
+        <w:tc>
+          <w:tcPr>
+            <w:tcW w:type="dxa" w:w="1800"/>
+            <w:tcBorders>
+              <w:top w:val="single" w:color="D9D9E0" w:sz="1"/>
+              <w:left w:val="single" w:color="D9D9E0" w:sz="1"/>
+              <w:bottom w:val="single" w:color="D9D9E0" w:sz="1"/>
+              <w:right w:val="single" w:color="D9D9E0" w:sz="1"/>
+            </w:tcBorders>
+            <w:tcMar>
+              <w:top w:type="dxa" w:w="60"/>
+              <w:left w:type="dxa" w:w="120"/>
+              <w:bottom w:type="dxa" w:w="60"/>
+              <w:right w:type="dxa" w:w="120"/>
+            </w:tcMar>
+          </w:tcPr>
+          <w:p>
+            <w:pPr>
+              <w:spacing w:after="0" w:line="252"/>
+            </w:pPr>
+            <w:r>
+              <w:rPr>
+                <w:b w:val="false"/>
+                <w:bCs w:val="false"/>
+                <w:color w:val="1A1A22"/>
+                <w:sz w:val="18"/>
+                <w:szCs w:val="18"/>
+                <w:rFonts w:ascii="Arial" w:cs="Arial" w:eastAsia="Arial" w:hAnsi="Arial"/>
+              </w:rPr>
+              <w:t xml:space="preserve">FULL</w:t>
+            </w:r>
+          </w:p>
+        </w:tc>
+      </w:tr>
+      <w:tr>
+        <w:tc>
+          <w:tcPr>
+            <w:tcW w:type="dxa" w:w="1760"/>
+            <w:tcBorders>
+              <w:top w:val="single" w:color="D9D9E0" w:sz="1"/>
+              <w:left w:val="single" w:color="D9D9E0" w:sz="1"/>
+              <w:bottom w:val="single" w:color="D9D9E0" w:sz="1"/>
+              <w:right w:val="single" w:color="D9D9E0" w:sz="1"/>
+            </w:tcBorders>
+            <w:tcMar>
+              <w:top w:type="dxa" w:w="60"/>
+              <w:left w:type="dxa" w:w="120"/>
+              <w:bottom w:type="dxa" w:w="60"/>
+              <w:right w:type="dxa" w:w="120"/>
+            </w:tcMar>
+          </w:tcPr>
+          <w:p>
+            <w:pPr>
+              <w:spacing w:after="0" w:line="252"/>
+            </w:pPr>
+            <w:r>
+              <w:rPr>
+                <w:b w:val="false"/>
+                <w:bCs w:val="false"/>
+                <w:color w:val="1A1A22"/>
+                <w:sz w:val="18"/>
+                <w:szCs w:val="18"/>
+                <w:rFonts w:ascii="Arial" w:cs="Arial" w:eastAsia="Arial" w:hAnsi="Arial"/>
+              </w:rPr>
+              <w:t xml:space="preserve">Model (egress)</w:t>
+            </w:r>
+          </w:p>
+        </w:tc>
+        <w:tc>
+          <w:tcPr>
+            <w:tcW w:type="dxa" w:w="1760"/>
+            <w:tcBorders>
+              <w:top w:val="single" w:color="D9D9E0" w:sz="1"/>
+              <w:left w:val="single" w:color="D9D9E0" w:sz="1"/>
+              <w:bottom w:val="single" w:color="D9D9E0" w:sz="1"/>
+              <w:right w:val="single" w:color="D9D9E0" w:sz="1"/>
+            </w:tcBorders>
+            <w:tcMar>
+              <w:top w:type="dxa" w:w="60"/>
+              <w:left w:type="dxa" w:w="120"/>
+              <w:bottom w:type="dxa" w:w="60"/>
+              <w:right w:type="dxa" w:w="120"/>
+            </w:tcMar>
+          </w:tcPr>
+          <w:p>
+            <w:pPr>
+              <w:spacing w:after="0" w:line="252"/>
+            </w:pPr>
+            <w:r>
+              <w:rPr>
+                <w:b w:val="false"/>
+                <w:bCs w:val="false"/>
+                <w:color w:val="1A1A22"/>
+                <w:sz w:val="18"/>
+                <w:szCs w:val="18"/>
+                <w:rFonts w:ascii="Arial" w:cs="Arial" w:eastAsia="Arial" w:hAnsi="Arial"/>
+              </w:rPr>
+              <w:t xml:space="preserve">LiteLLM proxy</w:t>
+            </w:r>
+          </w:p>
+        </w:tc>
+        <w:tc>
+          <w:tcPr>
+            <w:tcW w:type="dxa" w:w="4040"/>
+            <w:tcBorders>
+              <w:top w:val="single" w:color="D9D9E0" w:sz="1"/>
+              <w:left w:val="single" w:color="D9D9E0" w:sz="1"/>
+              <w:bottom w:val="single" w:color="D9D9E0" w:sz="1"/>
+              <w:right w:val="single" w:color="D9D9E0" w:sz="1"/>
+            </w:tcBorders>
+            <w:tcMar>
+              <w:top w:type="dxa" w:w="60"/>
+              <w:left w:type="dxa" w:w="120"/>
+              <w:bottom w:type="dxa" w:w="60"/>
+              <w:right w:type="dxa" w:w="120"/>
+            </w:tcMar>
+          </w:tcPr>
+          <w:p>
+            <w:pPr>
+              <w:spacing w:after="0" w:line="252"/>
+            </w:pPr>
+            <w:r>
+              <w:rPr>
+                <w:b w:val="false"/>
+                <w:bCs w:val="false"/>
+                <w:color w:val="1A1A22"/>
+                <w:sz w:val="18"/>
+                <w:szCs w:val="18"/>
+                <w:rFonts w:ascii="Arial" w:cs="Arial" w:eastAsia="Arial" w:hAnsi="Arial"/>
+              </w:rPr>
+              <w:t xml:space="preserve">Any agent, incl. closed-source — points base_url at our proxy.</w:t>
+            </w:r>
+          </w:p>
+        </w:tc>
+        <w:tc>
+          <w:tcPr>
+            <w:tcW w:type="dxa" w:w="1800"/>
+            <w:tcBorders>
+              <w:top w:val="single" w:color="D9D9E0" w:sz="1"/>
+              <w:left w:val="single" w:color="D9D9E0" w:sz="1"/>
+              <w:bottom w:val="single" w:color="D9D9E0" w:sz="1"/>
+              <w:right w:val="single" w:color="D9D9E0" w:sz="1"/>
+            </w:tcBorders>
+            <w:tcMar>
+              <w:top w:type="dxa" w:w="60"/>
+              <w:left w:type="dxa" w:w="120"/>
+              <w:bottom w:type="dxa" w:w="60"/>
+              <w:right w:type="dxa" w:w="120"/>
+            </w:tcMar>
+          </w:tcPr>
+          <w:p>
+            <w:pPr>
+              <w:spacing w:after="0" w:line="252"/>
+            </w:pPr>
+            <w:r>
+              <w:rPr>
+                <w:b w:val="false"/>
+                <w:bCs w:val="false"/>
+                <w:color w:val="1A1A22"/>
+                <w:sz w:val="18"/>
+                <w:szCs w:val="18"/>
+                <w:rFonts w:ascii="Arial" w:cs="Arial" w:eastAsia="Arial" w:hAnsi="Arial"/>
+              </w:rPr>
+              <w:t xml:space="preserve">PARTIAL</w:t>
+            </w:r>
+          </w:p>
+        </w:tc>
+      </w:tr>
+      <w:tr>
+        <w:tc>
+          <w:tcPr>
+            <w:tcW w:type="dxa" w:w="1760"/>
+            <w:tcBorders>
+              <w:top w:val="single" w:color="D9D9E0" w:sz="1"/>
+              <w:left w:val="single" w:color="D9D9E0" w:sz="1"/>
+              <w:bottom w:val="single" w:color="D9D9E0" w:sz="1"/>
+              <w:right w:val="single" w:color="D9D9E0" w:sz="1"/>
+            </w:tcBorders>
+            <w:tcMar>
+              <w:top w:type="dxa" w:w="60"/>
+              <w:left w:type="dxa" w:w="120"/>
+              <w:bottom w:type="dxa" w:w="60"/>
+              <w:right w:type="dxa" w:w="120"/>
+            </w:tcMar>
+          </w:tcPr>
+          <w:p>
+            <w:pPr>
+              <w:spacing w:after="0" w:line="252"/>
+            </w:pPr>
+            <w:r>
+              <w:rPr>
+                <w:b w:val="false"/>
+                <w:bCs w:val="false"/>
+                <w:color w:val="1A1A22"/>
+                <w:sz w:val="18"/>
+                <w:szCs w:val="18"/>
+                <w:rFonts w:ascii="Arial" w:cs="Arial" w:eastAsia="Arial" w:hAnsi="Arial"/>
+              </w:rPr>
+              <w:t xml:space="preserve">Tool (MCP)</w:t>
+            </w:r>
+          </w:p>
+        </w:tc>
+        <w:tc>
+          <w:tcPr>
+            <w:tcW w:type="dxa" w:w="1760"/>
+            <w:tcBorders>
+              <w:top w:val="single" w:color="D9D9E0" w:sz="1"/>
+              <w:left w:val="single" w:color="D9D9E0" w:sz="1"/>
+              <w:bottom w:val="single" w:color="D9D9E0" w:sz="1"/>
+              <w:right w:val="single" w:color="D9D9E0" w:sz="1"/>
+            </w:tcBorders>
+            <w:tcMar>
+              <w:top w:type="dxa" w:w="60"/>
+              <w:left w:type="dxa" w:w="120"/>
+              <w:bottom w:type="dxa" w:w="60"/>
+              <w:right w:type="dxa" w:w="120"/>
+            </w:tcMar>
+          </w:tcPr>
+          <w:p>
+            <w:pPr>
+              <w:spacing w:after="0" w:line="252"/>
+            </w:pPr>
+            <w:r>
+              <w:rPr>
+                <w:b w:val="false"/>
+                <w:bCs w:val="false"/>
+                <w:color w:val="1A1A22"/>
+                <w:sz w:val="18"/>
+                <w:szCs w:val="18"/>
+                <w:rFonts w:ascii="Arial" w:cs="Arial" w:eastAsia="Arial" w:hAnsi="Arial"/>
+              </w:rPr>
+              <w:t xml:space="preserve">MCP gateway → OTel</w:t>
+            </w:r>
+          </w:p>
+        </w:tc>
+        <w:tc>
+          <w:tcPr>
+            <w:tcW w:type="dxa" w:w="4040"/>
+            <w:tcBorders>
+              <w:top w:val="single" w:color="D9D9E0" w:sz="1"/>
+              <w:left w:val="single" w:color="D9D9E0" w:sz="1"/>
+              <w:bottom w:val="single" w:color="D9D9E0" w:sz="1"/>
+              <w:right w:val="single" w:color="D9D9E0" w:sz="1"/>
+            </w:tcBorders>
+            <w:tcMar>
+              <w:top w:type="dxa" w:w="60"/>
+              <w:left w:type="dxa" w:w="120"/>
+              <w:bottom w:type="dxa" w:w="60"/>
+              <w:right w:type="dxa" w:w="120"/>
+            </w:tcMar>
+          </w:tcPr>
+          <w:p>
+            <w:pPr>
+              <w:spacing w:after="0" w:line="252"/>
+            </w:pPr>
+            <w:r>
+              <w:rPr>
+                <w:b w:val="false"/>
+                <w:bCs w:val="false"/>
+                <w:color w:val="1A1A22"/>
+                <w:sz w:val="18"/>
+                <w:szCs w:val="18"/>
+                <w:rFonts w:ascii="Arial" w:cs="Arial" w:eastAsia="Arial" w:hAnsi="Arial"/>
+              </w:rPr>
+              <w:t xml:space="preserve">Agents whose tools are MCP servers.</w:t>
+            </w:r>
+          </w:p>
+        </w:tc>
+        <w:tc>
+          <w:tcPr>
+            <w:tcW w:type="dxa" w:w="1800"/>
+            <w:tcBorders>
+              <w:top w:val="single" w:color="D9D9E0" w:sz="1"/>
+              <w:left w:val="single" w:color="D9D9E0" w:sz="1"/>
+              <w:bottom w:val="single" w:color="D9D9E0" w:sz="1"/>
+              <w:right w:val="single" w:color="D9D9E0" w:sz="1"/>
+            </w:tcBorders>
+            <w:tcMar>
+              <w:top w:type="dxa" w:w="60"/>
+              <w:left w:type="dxa" w:w="120"/>
+              <w:bottom w:type="dxa" w:w="60"/>
+              <w:right w:type="dxa" w:w="120"/>
+            </w:tcMar>
+          </w:tcPr>
+          <w:p>
+            <w:pPr>
+              <w:spacing w:after="0" w:line="252"/>
+            </w:pPr>
+            <w:r>
+              <w:rPr>
+                <w:b w:val="false"/>
+                <w:bCs w:val="false"/>
+                <w:color w:val="1A1A22"/>
+                <w:sz w:val="18"/>
+                <w:szCs w:val="18"/>
+                <w:rFonts w:ascii="Arial" w:cs="Arial" w:eastAsia="Arial" w:hAnsi="Arial"/>
+              </w:rPr>
+              <w:t xml:space="preserve">FULL (MCP only)</w:t>
+            </w:r>
+          </w:p>
+        </w:tc>
+      </w:tr>
+      <w:tr>
+        <w:tc>
+          <w:tcPr>
+            <w:tcW w:type="dxa" w:w="1760"/>
+            <w:tcBorders>
+              <w:top w:val="single" w:color="D9D9E0" w:sz="1"/>
+              <w:left w:val="single" w:color="D9D9E0" w:sz="1"/>
+              <w:bottom w:val="single" w:color="D9D9E0" w:sz="1"/>
+              <w:right w:val="single" w:color="D9D9E0" w:sz="1"/>
+            </w:tcBorders>
+            <w:tcMar>
+              <w:top w:type="dxa" w:w="60"/>
+              <w:left w:type="dxa" w:w="120"/>
+              <w:bottom w:type="dxa" w:w="60"/>
+              <w:right w:type="dxa" w:w="120"/>
+            </w:tcMar>
+          </w:tcPr>
+          <w:p>
+            <w:pPr>
+              <w:spacing w:after="0" w:line="252"/>
+            </w:pPr>
+            <w:r>
+              <w:rPr>
+                <w:b w:val="false"/>
+                <w:bCs w:val="false"/>
+                <w:color w:val="1A1A22"/>
+                <w:sz w:val="18"/>
+                <w:szCs w:val="18"/>
+                <w:rFonts w:ascii="Arial" w:cs="Arial" w:eastAsia="Arial" w:hAnsi="Arial"/>
+              </w:rPr>
+              <w:t xml:space="preserve">Telemetry (OTel)</w:t>
+            </w:r>
+          </w:p>
+        </w:tc>
+        <w:tc>
+          <w:tcPr>
+            <w:tcW w:type="dxa" w:w="1760"/>
+            <w:tcBorders>
+              <w:top w:val="single" w:color="D9D9E0" w:sz="1"/>
+              <w:left w:val="single" w:color="D9D9E0" w:sz="1"/>
+              <w:bottom w:val="single" w:color="D9D9E0" w:sz="1"/>
+              <w:right w:val="single" w:color="D9D9E0" w:sz="1"/>
+            </w:tcBorders>
+            <w:tcMar>
+              <w:top w:type="dxa" w:w="60"/>
+              <w:left w:type="dxa" w:w="120"/>
+              <w:bottom w:type="dxa" w:w="60"/>
+              <w:right w:type="dxa" w:w="120"/>
+            </w:tcMar>
+          </w:tcPr>
+          <w:p>
+            <w:pPr>
+              <w:spacing w:after="0" w:line="252"/>
+            </w:pPr>
+            <w:r>
+              <w:rPr>
+                <w:b w:val="false"/>
+                <w:bCs w:val="false"/>
+                <w:color w:val="1A1A22"/>
+                <w:sz w:val="18"/>
+                <w:szCs w:val="18"/>
+                <w:rFonts w:ascii="Arial" w:cs="Arial" w:eastAsia="Arial" w:hAnsi="Arial"/>
+              </w:rPr>
+              <w:t xml:space="preserve">OTel ingester</w:t>
+            </w:r>
+          </w:p>
+        </w:tc>
+        <w:tc>
+          <w:tcPr>
+            <w:tcW w:type="dxa" w:w="4040"/>
+            <w:tcBorders>
+              <w:top w:val="single" w:color="D9D9E0" w:sz="1"/>
+              <w:left w:val="single" w:color="D9D9E0" w:sz="1"/>
+              <w:bottom w:val="single" w:color="D9D9E0" w:sz="1"/>
+              <w:right w:val="single" w:color="D9D9E0" w:sz="1"/>
+            </w:tcBorders>
+            <w:tcMar>
+              <w:top w:type="dxa" w:w="60"/>
+              <w:left w:type="dxa" w:w="120"/>
+              <w:bottom w:type="dxa" w:w="60"/>
+              <w:right w:type="dxa" w:w="120"/>
+            </w:tcMar>
+          </w:tcPr>
+          <w:p>
+            <w:pPr>
+              <w:spacing w:after="0" w:line="252"/>
+            </w:pPr>
+            <w:r>
+              <w:rPr>
+                <w:b w:val="false"/>
+                <w:bCs w:val="false"/>
+                <w:color w:val="1A1A22"/>
+                <w:sz w:val="18"/>
+                <w:szCs w:val="18"/>
+                <w:rFonts w:ascii="Arial" w:cs="Arial" w:eastAsia="Arial" w:hAnsi="Arial"/>
+              </w:rPr>
+              <w:t xml:space="preserve">OTel-instrumented frameworks (LangChain, LlamaIndex, CrewAI).</w:t>
+            </w:r>
+          </w:p>
+        </w:tc>
+        <w:tc>
+          <w:tcPr>
+            <w:tcW w:type="dxa" w:w="1800"/>
+            <w:tcBorders>
+              <w:top w:val="single" w:color="D9D9E0" w:sz="1"/>
+              <w:left w:val="single" w:color="D9D9E0" w:sz="1"/>
+              <w:bottom w:val="single" w:color="D9D9E0" w:sz="1"/>
+              <w:right w:val="single" w:color="D9D9E0" w:sz="1"/>
+            </w:tcBorders>
+            <w:tcMar>
+              <w:top w:type="dxa" w:w="60"/>
+              <w:left w:type="dxa" w:w="120"/>
+              <w:bottom w:type="dxa" w:w="60"/>
+              <w:right w:type="dxa" w:w="120"/>
+            </w:tcMar>
+          </w:tcPr>
+          <w:p>
+            <w:pPr>
+              <w:spacing w:after="0" w:line="252"/>
+            </w:pPr>
+            <w:r>
+              <w:rPr>
+                <w:b w:val="false"/>
+                <w:bCs w:val="false"/>
+                <w:color w:val="1A1A22"/>
+                <w:sz w:val="18"/>
+                <w:szCs w:val="18"/>
+                <w:rFonts w:ascii="Arial" w:cs="Arial" w:eastAsia="Arial" w:hAnsi="Arial"/>
+              </w:rPr>
+              <w:t xml:space="preserve">Conditional</w:t>
+            </w:r>
+          </w:p>
+        </w:tc>
+      </w:tr>
+      <w:tr>
+        <w:tc>
+          <w:tcPr>
+            <w:tcW w:type="dxa" w:w="1760"/>
+            <w:tcBorders>
+              <w:top w:val="single" w:color="D9D9E0" w:sz="1"/>
+              <w:left w:val="single" w:color="D9D9E0" w:sz="1"/>
+              <w:bottom w:val="single" w:color="D9D9E0" w:sz="1"/>
+              <w:right w:val="single" w:color="D9D9E0" w:sz="1"/>
+            </w:tcBorders>
+            <w:tcMar>
+              <w:top w:type="dxa" w:w="60"/>
+              <w:left w:type="dxa" w:w="120"/>
+              <w:bottom w:type="dxa" w:w="60"/>
+              <w:right w:type="dxa" w:w="120"/>
+            </w:tcMar>
+          </w:tcPr>
+          <w:p>
+            <w:pPr>
+              <w:spacing w:after="0" w:line="252"/>
+            </w:pPr>
+            <w:r>
+              <w:rPr>
+                <w:b w:val="false"/>
+                <w:bCs w:val="false"/>
+                <w:color w:val="1A1A22"/>
+                <w:sz w:val="18"/>
+                <w:szCs w:val="18"/>
+                <w:rFonts w:ascii="Arial" w:cs="Arial" w:eastAsia="Arial" w:hAnsi="Arial"/>
+              </w:rPr>
+              <w:t xml:space="preserve">Agent (A2A)</w:t>
+            </w:r>
+          </w:p>
+        </w:tc>
+        <w:tc>
+          <w:tcPr>
+            <w:tcW w:type="dxa" w:w="1760"/>
+            <w:tcBorders>
+              <w:top w:val="single" w:color="D9D9E0" w:sz="1"/>
+              <w:left w:val="single" w:color="D9D9E0" w:sz="1"/>
+              <w:bottom w:val="single" w:color="D9D9E0" w:sz="1"/>
+              <w:right w:val="single" w:color="D9D9E0" w:sz="1"/>
+            </w:tcBorders>
+            <w:tcMar>
+              <w:top w:type="dxa" w:w="60"/>
+              <w:left w:type="dxa" w:w="120"/>
+              <w:bottom w:type="dxa" w:w="60"/>
+              <w:right w:type="dxa" w:w="120"/>
+            </w:tcMar>
+          </w:tcPr>
+          <w:p>
+            <w:pPr>
+              <w:spacing w:after="0" w:line="252"/>
+            </w:pPr>
+            <w:r>
+              <w:rPr>
+                <w:b w:val="false"/>
+                <w:bCs w:val="false"/>
+                <w:color w:val="1A1A22"/>
+                <w:sz w:val="18"/>
+                <w:szCs w:val="18"/>
+                <w:rFonts w:ascii="Arial" w:cs="Arial" w:eastAsia="Arial" w:hAnsi="Arial"/>
+              </w:rPr>
+              <w:t xml:space="preserve">A2A interceptor</w:t>
+            </w:r>
+          </w:p>
+        </w:tc>
+        <w:tc>
+          <w:tcPr>
+            <w:tcW w:type="dxa" w:w="4040"/>
+            <w:tcBorders>
+              <w:top w:val="single" w:color="D9D9E0" w:sz="1"/>
+              <w:left w:val="single" w:color="D9D9E0" w:sz="1"/>
+              <w:bottom w:val="single" w:color="D9D9E0" w:sz="1"/>
+              <w:right w:val="single" w:color="D9D9E0" w:sz="1"/>
+            </w:tcBorders>
+            <w:tcMar>
+              <w:top w:type="dxa" w:w="60"/>
+              <w:left w:type="dxa" w:w="120"/>
+              <w:bottom w:type="dxa" w:w="60"/>
+              <w:right w:type="dxa" w:w="120"/>
+            </w:tcMar>
+          </w:tcPr>
+          <w:p>
+            <w:pPr>
+              <w:spacing w:after="0" w:line="252"/>
+            </w:pPr>
+            <w:r>
+              <w:rPr>
+                <w:b w:val="false"/>
+                <w:bCs w:val="false"/>
+                <w:color w:val="1A1A22"/>
+                <w:sz w:val="18"/>
+                <w:szCs w:val="18"/>
+                <w:rFonts w:ascii="Arial" w:cs="Arial" w:eastAsia="Arial" w:hAnsi="Arial"/>
+              </w:rPr>
+              <w:t xml:space="preserve">Agents exposed over A2A. Coarsest granularity.</w:t>
+            </w:r>
+          </w:p>
+        </w:tc>
+        <w:tc>
+          <w:tcPr>
+            <w:tcW w:type="dxa" w:w="1800"/>
+            <w:tcBorders>
+              <w:top w:val="single" w:color="D9D9E0" w:sz="1"/>
+              <w:left w:val="single" w:color="D9D9E0" w:sz="1"/>
+              <w:bottom w:val="single" w:color="D9D9E0" w:sz="1"/>
+              <w:right w:val="single" w:color="D9D9E0" w:sz="1"/>
+            </w:tcBorders>
+            <w:tcMar>
+              <w:top w:type="dxa" w:w="60"/>
+              <w:left w:type="dxa" w:w="120"/>
+              <w:bottom w:type="dxa" w:w="60"/>
+              <w:right w:type="dxa" w:w="120"/>
+            </w:tcMar>
+          </w:tcPr>
+          <w:p>
+            <w:pPr>
+              <w:spacing w:after="0" w:line="252"/>
+            </w:pPr>
+            <w:r>
+              <w:rPr>
+                <w:b w:val="false"/>
+                <w:bCs w:val="false"/>
+                <w:color w:val="1A1A22"/>
+                <w:sz w:val="18"/>
+                <w:szCs w:val="18"/>
+                <w:rFonts w:ascii="Arial" w:cs="Arial" w:eastAsia="Arial" w:hAnsi="Arial"/>
+              </w:rPr>
+              <w:t xml:space="preserve">Deferred (post-v1)</w:t>
+            </w:r>
+          </w:p>
+        </w:tc>
+      </w:tr>
+    </w:tbl>
     <w:p>
       <w:r>
         <w:br w:type="page"/>

</xml_diff>

<commit_message>
docs: concept section — note auto-promotion + add overview diagram
Section 1 (The concept):
- Reword the apprentice paragraph so promotion is "whether auto-promoted
  or human-approved" (was "once a human approves") — reflects the
  auto-promotion policy already in the component design.
- Add the production-architecture diagram as an at-a-glance overview
  right after the paragraph (same diagram detailed in §4), in both the
  HTML (inline SVG, unique marker IDs) and Word (embedded PNG) docs.

Co-Authored-By: Claude Opus 4.8 <noreply@anthropic.com>
</commit_message>
<xml_diff>
--- a/docs/design/aprntc-design.docx
+++ b/docs/design/aprntc-design.docx
@@ -43,7 +43,7 @@
           <w:szCs w:val="22"/>
           <w:rFonts w:ascii="Arial" w:cs="Arial" w:eastAsia="Arial" w:hAnsi="Arial"/>
         </w:rPr>
-        <w:t xml:space="preserve">A self-improving agent that shadows a live agent, distills lessons from its behavior, and is promoted — gated by a human — to a measurably better successor. Codename </w:t>
+        <w:t xml:space="preserve">A self-improving agent that shadows a live agent, distills lessons from its behavior, and is promoted — automatically or with human approval — to a measurably better successor. Codename </w:t>
       </w:r>
       <w:r>
         <w:rPr>
@@ -98,7 +98,7 @@
           <w:szCs w:val="20"/>
           <w:rFonts w:ascii="Arial" w:cs="Arial" w:eastAsia="Arial" w:hAnsi="Arial"/>
         </w:rPr>
-        <w:t xml:space="preserve">Generated:  2026-06-17</w:t>
+        <w:t xml:space="preserve">Generated:  2026-06-18</w:t>
       </w:r>
     </w:p>
     <w:p>
@@ -305,231 +305,60 @@
           <w:szCs w:val="21"/>
           <w:rFonts w:ascii="Arial" w:cs="Arial" w:eastAsia="Arial" w:hAnsi="Arial"/>
         </w:rPr>
-        <w:t xml:space="preserve">An apprentice (“child”) agent is cloned from a live parent, passively shadows it, distills lessons from what worked and what didn’t, becomes measurably better, and — once a human approves — is promoted to replace it. Then the cycle repeats.</w:t>
-      </w:r>
-    </w:p>
-    <w:tbl>
-      <w:tblPr>
-        <w:tblW w:type="dxa" w:w="9360"/>
-        <w:tblBorders>
-          <w:top w:val="single" w:color="auto" w:sz="4"/>
-          <w:left w:val="single" w:color="auto" w:sz="4"/>
-          <w:bottom w:val="single" w:color="auto" w:sz="4"/>
-          <w:right w:val="single" w:color="auto" w:sz="4"/>
-          <w:insideH w:val="single" w:color="auto" w:sz="4"/>
-          <w:insideV w:val="single" w:color="auto" w:sz="4"/>
-        </w:tblBorders>
-      </w:tblPr>
-      <w:tblGrid>
-        <w:gridCol w:w="9360"/>
-      </w:tblGrid>
-      <w:tr>
-        <w:tc>
-          <w:tcPr>
-            <w:tcBorders>
-              <w:top w:val="single" w:color="D9D9E0" w:sz="1"/>
-              <w:left w:val="single" w:color="4F46E5" w:sz="18"/>
-              <w:bottom w:val="single" w:color="D9D9E0" w:sz="1"/>
-              <w:right w:val="single" w:color="D9D9E0" w:sz="1"/>
-            </w:tcBorders>
-            <w:shd w:fill="EFEEFB" w:val="clear"/>
-            <w:tcMar>
-              <w:top w:type="dxa" w:w="120"/>
-              <w:left w:type="dxa" w:w="180"/>
-              <w:bottom w:type="dxa" w:w="120"/>
-              <w:right w:type="dxa" w:w="160"/>
-            </w:tcMar>
-          </w:tcPr>
-          <w:p>
-            <w:pPr>
-              <w:spacing w:after="40"/>
-            </w:pPr>
-            <w:r>
-              <w:rPr>
-                <w:b/>
-                <w:bCs/>
-                <w:color w:val="5A5A66"/>
-                <w:sz w:val="16"/>
-                <w:szCs w:val="16"/>
-                <w:rFonts w:ascii="Arial" w:cs="Arial" w:eastAsia="Arial" w:hAnsi="Arial"/>
-                <w:spacing w:val="4"/>
-              </w:rPr>
-              <w:t xml:space="preserve">SCOPING PRINCIPLE (LOAD-BEARING)</w:t>
-            </w:r>
-          </w:p>
-          <w:p>
-            <w:pPr>
-              <w:spacing w:after="0" w:line="264"/>
-            </w:pPr>
-            <w:r>
-              <w:rPr>
-                <w:color w:val="1A1A22"/>
-                <w:sz w:val="21"/>
-                <w:szCs w:val="21"/>
-                <w:rFonts w:ascii="Arial" w:cs="Arial" w:eastAsia="Arial" w:hAnsi="Arial"/>
-              </w:rPr>
-              <w:t xml:space="preserve">aprntc is </w:t>
-            </w:r>
-            <w:r>
-              <w:rPr>
-                <w:b/>
-                <w:bCs/>
-                <w:color w:val="1A1A22"/>
-                <w:sz w:val="21"/>
-                <w:szCs w:val="21"/>
-                <w:rFonts w:ascii="Arial" w:cs="Arial" w:eastAsia="Arial" w:hAnsi="Arial"/>
-              </w:rPr>
-              <w:t xml:space="preserve">not</w:t>
-            </w:r>
-            <w:r>
-              <w:rPr>
-                <w:color w:val="1A1A22"/>
-                <w:sz w:val="21"/>
-                <w:szCs w:val="21"/>
-                <w:rFonts w:ascii="Arial" w:cs="Arial" w:eastAsia="Arial" w:hAnsi="Arial"/>
-              </w:rPr>
-              <w:t xml:space="preserve"> a monitoring or observability product. It learns from the parent’s overall </w:t>
-            </w:r>
-            <w:r>
-              <w:rPr>
-                <w:i/>
-                <w:iCs/>
-                <w:color w:val="1A1A22"/>
-                <w:sz w:val="21"/>
-                <w:szCs w:val="21"/>
-                <w:rFonts w:ascii="Arial" w:cs="Arial" w:eastAsia="Arial" w:hAnsi="Arial"/>
-              </w:rPr>
-              <w:t xml:space="preserve">response quality</w:t>
-            </w:r>
-            <w:r>
-              <w:rPr>
-                <w:color w:val="1A1A22"/>
-                <w:sz w:val="21"/>
-                <w:szCs w:val="21"/>
-                <w:rFonts w:ascii="Arial" w:cs="Arial" w:eastAsia="Arial" w:hAnsi="Arial"/>
-              </w:rPr>
-              <w:t xml:space="preserve"> to produce a better successor — episode- and task-level quality signal is the target, not exhaustive trace capture.</w:t>
-            </w:r>
-          </w:p>
-        </w:tc>
-      </w:tr>
-    </w:tbl>
-    <w:p>
-      <w:pPr>
-        <w:pStyle w:val="Heading1"/>
-      </w:pPr>
-      <w:r>
-        <w:rPr>
-          <w:rFonts w:ascii="Arial" w:cs="Arial" w:eastAsia="Arial" w:hAnsi="Arial"/>
-        </w:rPr>
-        <w:t xml:space="preserve">2.  What the “child” actually is</w:t>
+        <w:t xml:space="preserve">An apprentice (“child”) agent is cloned from a live parent, passively shadows it, distills lessons from what worked and what didn’t, becomes measurably better, and — whether </w:t>
+      </w:r>
+      <w:r>
+        <w:rPr>
+          <w:b/>
+          <w:bCs/>
+          <w:color w:val="1A1A22"/>
+          <w:sz w:val="21"/>
+          <w:szCs w:val="21"/>
+          <w:rFonts w:ascii="Arial" w:cs="Arial" w:eastAsia="Arial" w:hAnsi="Arial"/>
+        </w:rPr>
+        <w:t xml:space="preserve">auto-promoted</w:t>
+      </w:r>
+      <w:r>
+        <w:rPr>
+          <w:color w:val="1A1A22"/>
+          <w:sz w:val="21"/>
+          <w:szCs w:val="21"/>
+          <w:rFonts w:ascii="Arial" w:cs="Arial" w:eastAsia="Arial" w:hAnsi="Arial"/>
+        </w:rPr>
+        <w:t xml:space="preserve"> or </w:t>
+      </w:r>
+      <w:r>
+        <w:rPr>
+          <w:b/>
+          <w:bCs/>
+          <w:color w:val="1A1A22"/>
+          <w:sz w:val="21"/>
+          <w:szCs w:val="21"/>
+          <w:rFonts w:ascii="Arial" w:cs="Arial" w:eastAsia="Arial" w:hAnsi="Arial"/>
+        </w:rPr>
+        <w:t xml:space="preserve">human-approved</w:t>
+      </w:r>
+      <w:r>
+        <w:rPr>
+          <w:color w:val="1A1A22"/>
+          <w:sz w:val="21"/>
+          <w:szCs w:val="21"/>
+          <w:rFonts w:ascii="Arial" w:cs="Arial" w:eastAsia="Arial" w:hAnsi="Arial"/>
+        </w:rPr>
+        <w:t xml:space="preserve"> — is promoted to replace it. Then the cycle repeats.</w:t>
       </w:r>
     </w:p>
     <w:p>
       <w:pPr>
-        <w:spacing w:after="120" w:line="276"/>
-      </w:pPr>
-      <w:r>
-        <w:rPr>
-          <w:color w:val="1A1A22"/>
-          <w:sz w:val="21"/>
-          <w:szCs w:val="21"/>
-          <w:rFonts w:ascii="Arial" w:cs="Arial" w:eastAsia="Arial" w:hAnsi="Arial"/>
-        </w:rPr>
-        <w:t xml:space="preserve">The single most important thing to understand: </w:t>
-      </w:r>
-      <w:r>
-        <w:rPr>
-          <w:b/>
-          <w:bCs/>
-          <w:color w:val="1A1A22"/>
-          <w:sz w:val="21"/>
-          <w:szCs w:val="21"/>
-          <w:rFonts w:ascii="Arial" w:cs="Arial" w:eastAsia="Arial" w:hAnsi="Arial"/>
-        </w:rPr>
-        <w:t xml:space="preserve">there is no separate “child program.”</w:t>
-      </w:r>
-      <w:r>
-        <w:rPr>
-          <w:color w:val="1A1A22"/>
-          <w:sz w:val="21"/>
-          <w:szCs w:val="21"/>
-          <w:rFonts w:ascii="Arial" w:cs="Arial" w:eastAsia="Arial" w:hAnsi="Arial"/>
-        </w:rPr>
-        <w:t xml:space="preserve"> An agent = a </w:t>
-      </w:r>
-      <w:r>
-        <w:rPr>
-          <w:b/>
-          <w:bCs/>
-          <w:color w:val="1A1A22"/>
-          <w:sz w:val="21"/>
-          <w:szCs w:val="21"/>
-          <w:rFonts w:ascii="Arial" w:cs="Arial" w:eastAsia="Arial" w:hAnsi="Arial"/>
-        </w:rPr>
-        <w:t xml:space="preserve">fixed engine</w:t>
-      </w:r>
-      <w:r>
-        <w:rPr>
-          <w:color w:val="1A1A22"/>
-          <w:sz w:val="21"/>
-          <w:szCs w:val="21"/>
-          <w:rFonts w:ascii="Arial" w:cs="Arial" w:eastAsia="Arial" w:hAnsi="Arial"/>
-        </w:rPr>
-        <w:t xml:space="preserve"> (the LLM, retrieval, tools, the loop) </w:t>
-      </w:r>
-      <w:r>
-        <w:rPr>
-          <w:b/>
-          <w:bCs/>
-          <w:color w:val="1A1A22"/>
-          <w:sz w:val="21"/>
-          <w:szCs w:val="21"/>
-          <w:rFonts w:ascii="Arial" w:cs="Arial" w:eastAsia="Arial" w:hAnsi="Arial"/>
-        </w:rPr>
-        <w:t xml:space="preserve">+ a Playbook</w:t>
-      </w:r>
-      <w:r>
-        <w:rPr>
-          <w:color w:val="1A1A22"/>
-          <w:sz w:val="21"/>
-          <w:szCs w:val="21"/>
-          <w:rFonts w:ascii="Arial" w:cs="Arial" w:eastAsia="Arial" w:hAnsi="Arial"/>
-        </w:rPr>
-        <w:t xml:space="preserve"> (a config artifact: system prompt + directives + exemplars + “watch-out” lessons). Parent and child share the </w:t>
-      </w:r>
-      <w:r>
-        <w:rPr>
-          <w:i/>
-          <w:iCs/>
-          <w:color w:val="1A1A22"/>
-          <w:sz w:val="21"/>
-          <w:szCs w:val="21"/>
-          <w:rFonts w:ascii="Arial" w:cs="Arial" w:eastAsia="Arial" w:hAnsi="Arial"/>
-        </w:rPr>
-        <w:t xml:space="preserve">exact same engine</w:t>
-      </w:r>
-      <w:r>
-        <w:rPr>
-          <w:color w:val="1A1A22"/>
-          <w:sz w:val="21"/>
-          <w:szCs w:val="21"/>
-          <w:rFonts w:ascii="Arial" w:cs="Arial" w:eastAsia="Arial" w:hAnsi="Arial"/>
-        </w:rPr>
-        <w:t xml:space="preserve"> — the only difference between them is the Playbook.</w:t>
-      </w:r>
-    </w:p>
-    <w:p>
-      <w:pPr>
         <w:spacing w:before="120" w:after="60"/>
         <w:jc w:val="center"/>
       </w:pPr>
       <w:r>
         <w:drawing>
           <wp:inline distT="0" distB="0" distL="0" distR="0">
-            <wp:extent cx="5715000" cy="4286250"/>
+            <wp:extent cx="5943600" cy="3629025"/>
             <wp:effectExtent t="0" r="0" b="0" l="0"/>
-            <wp:docPr id="1" name="fig1-child.png" descr="Figure 1 — The parent and child share one engine. Only the Playbook differs; promotion swaps it." title="Figure 1 — The parent and child share one engine. Only the Playbook differs; promotion swaps it."/>
+            <wp:docPr id="1" name="fig3-production.png" descr="The system at a glance — aprntc runs beside production: it observes the parent through a read-only tap (inbound) and serves the improved playbook the agent pulls (outbound). Promotion is the only write back, and it is gated — applied automatically for low-risk diffs or after human approval. Detailed in §4." title="The system at a glance — aprntc runs beside production: it o"/>
             <wp:cNvGraphicFramePr>
               <a:graphicFrameLocks xmlns:a="http://schemas.openxmlformats.org/drawingml/2006/main" noChangeAspect="1"/>
             </wp:cNvGraphicFramePr>
@@ -552,7 +381,7 @@
                   <pic:spPr bwMode="auto">
                     <a:xfrm>
                       <a:off x="0" y="0"/>
-                      <a:ext cx="5715000" cy="4286250"/>
+                      <a:ext cx="5943600" cy="3629025"/>
                     </a:xfrm>
                     <a:prstGeom prst="rect">
                       <a:avLst/>
@@ -579,7 +408,124 @@
           <w:szCs w:val="17"/>
           <w:rFonts w:ascii="Arial" w:cs="Arial" w:eastAsia="Arial" w:hAnsi="Arial"/>
         </w:rPr>
-        <w:t xml:space="preserve">Figure 1 — The parent and child share one engine. Only the Playbook differs; promotion swaps it.</w:t>
+        <w:t xml:space="preserve">The system at a glance — aprntc runs beside production: it observes the parent through a read-only tap (inbound) and serves the improved playbook the agent pulls (outbound). Promotion is the only write back, and it is gated — applied automatically for low-risk diffs or after human approval. Detailed in §4.</w:t>
+      </w:r>
+    </w:p>
+    <w:tbl>
+      <w:tblPr>
+        <w:tblW w:type="dxa" w:w="9360"/>
+        <w:tblBorders>
+          <w:top w:val="single" w:color="auto" w:sz="4"/>
+          <w:left w:val="single" w:color="auto" w:sz="4"/>
+          <w:bottom w:val="single" w:color="auto" w:sz="4"/>
+          <w:right w:val="single" w:color="auto" w:sz="4"/>
+          <w:insideH w:val="single" w:color="auto" w:sz="4"/>
+          <w:insideV w:val="single" w:color="auto" w:sz="4"/>
+        </w:tblBorders>
+      </w:tblPr>
+      <w:tblGrid>
+        <w:gridCol w:w="9360"/>
+      </w:tblGrid>
+      <w:tr>
+        <w:tc>
+          <w:tcPr>
+            <w:tcBorders>
+              <w:top w:val="single" w:color="D9D9E0" w:sz="1"/>
+              <w:left w:val="single" w:color="4F46E5" w:sz="18"/>
+              <w:bottom w:val="single" w:color="D9D9E0" w:sz="1"/>
+              <w:right w:val="single" w:color="D9D9E0" w:sz="1"/>
+            </w:tcBorders>
+            <w:shd w:fill="EFEEFB" w:val="clear"/>
+            <w:tcMar>
+              <w:top w:type="dxa" w:w="120"/>
+              <w:left w:type="dxa" w:w="180"/>
+              <w:bottom w:type="dxa" w:w="120"/>
+              <w:right w:type="dxa" w:w="160"/>
+            </w:tcMar>
+          </w:tcPr>
+          <w:p>
+            <w:pPr>
+              <w:spacing w:after="40"/>
+            </w:pPr>
+            <w:r>
+              <w:rPr>
+                <w:b/>
+                <w:bCs/>
+                <w:color w:val="5A5A66"/>
+                <w:sz w:val="16"/>
+                <w:szCs w:val="16"/>
+                <w:rFonts w:ascii="Arial" w:cs="Arial" w:eastAsia="Arial" w:hAnsi="Arial"/>
+                <w:spacing w:val="4"/>
+              </w:rPr>
+              <w:t xml:space="preserve">SCOPING PRINCIPLE (LOAD-BEARING)</w:t>
+            </w:r>
+          </w:p>
+          <w:p>
+            <w:pPr>
+              <w:spacing w:after="0" w:line="264"/>
+            </w:pPr>
+            <w:r>
+              <w:rPr>
+                <w:color w:val="1A1A22"/>
+                <w:sz w:val="21"/>
+                <w:szCs w:val="21"/>
+                <w:rFonts w:ascii="Arial" w:cs="Arial" w:eastAsia="Arial" w:hAnsi="Arial"/>
+              </w:rPr>
+              <w:t xml:space="preserve">aprntc is </w:t>
+            </w:r>
+            <w:r>
+              <w:rPr>
+                <w:b/>
+                <w:bCs/>
+                <w:color w:val="1A1A22"/>
+                <w:sz w:val="21"/>
+                <w:szCs w:val="21"/>
+                <w:rFonts w:ascii="Arial" w:cs="Arial" w:eastAsia="Arial" w:hAnsi="Arial"/>
+              </w:rPr>
+              <w:t xml:space="preserve">not</w:t>
+            </w:r>
+            <w:r>
+              <w:rPr>
+                <w:color w:val="1A1A22"/>
+                <w:sz w:val="21"/>
+                <w:szCs w:val="21"/>
+                <w:rFonts w:ascii="Arial" w:cs="Arial" w:eastAsia="Arial" w:hAnsi="Arial"/>
+              </w:rPr>
+              <w:t xml:space="preserve"> a monitoring or observability product. It learns from the parent’s overall </w:t>
+            </w:r>
+            <w:r>
+              <w:rPr>
+                <w:i/>
+                <w:iCs/>
+                <w:color w:val="1A1A22"/>
+                <w:sz w:val="21"/>
+                <w:szCs w:val="21"/>
+                <w:rFonts w:ascii="Arial" w:cs="Arial" w:eastAsia="Arial" w:hAnsi="Arial"/>
+              </w:rPr>
+              <w:t xml:space="preserve">response quality</w:t>
+            </w:r>
+            <w:r>
+              <w:rPr>
+                <w:color w:val="1A1A22"/>
+                <w:sz w:val="21"/>
+                <w:szCs w:val="21"/>
+                <w:rFonts w:ascii="Arial" w:cs="Arial" w:eastAsia="Arial" w:hAnsi="Arial"/>
+              </w:rPr>
+              <w:t xml:space="preserve"> to produce a better successor — episode- and task-level quality signal is the target, not exhaustive trace capture.</w:t>
+            </w:r>
+          </w:p>
+        </w:tc>
+      </w:tr>
+    </w:tbl>
+    <w:p>
+      <w:pPr>
+        <w:pStyle w:val="Heading1"/>
+      </w:pPr>
+      <w:r>
+        <w:rPr>
+          <w:rFonts w:ascii="Arial" w:cs="Arial" w:eastAsia="Arial" w:hAnsi="Arial"/>
+        </w:rPr>
+        <w:t xml:space="preserve">2.  What the “child” actually is</w:t>
       </w:r>
     </w:p>
     <w:p>
@@ -593,7 +539,7 @@
           <w:szCs w:val="21"/>
           <w:rFonts w:ascii="Arial" w:cs="Arial" w:eastAsia="Arial" w:hAnsi="Arial"/>
         </w:rPr>
-        <w:t xml:space="preserve">This is the </w:t>
+        <w:t xml:space="preserve">The single most important thing to understand: </w:t>
       </w:r>
       <w:r>
         <w:rPr>
@@ -604,16 +550,56 @@
           <w:szCs w:val="21"/>
           <w:rFonts w:ascii="Arial" w:cs="Arial" w:eastAsia="Arial" w:hAnsi="Arial"/>
         </w:rPr>
-        <w:t xml:space="preserve">Phase-1 mechanism</w:t>
-      </w:r>
-      <w:r>
-        <w:rPr>
-          <w:color w:val="1A1A22"/>
-          <w:sz w:val="21"/>
-          <w:szCs w:val="21"/>
-          <w:rFonts w:ascii="Arial" w:cs="Arial" w:eastAsia="Arial" w:hAnsi="Arial"/>
-        </w:rPr>
-        <w:t xml:space="preserve">: playbook distillation, </w:t>
+        <w:t xml:space="preserve">there is no separate “child program.”</w:t>
+      </w:r>
+      <w:r>
+        <w:rPr>
+          <w:color w:val="1A1A22"/>
+          <w:sz w:val="21"/>
+          <w:szCs w:val="21"/>
+          <w:rFonts w:ascii="Arial" w:cs="Arial" w:eastAsia="Arial" w:hAnsi="Arial"/>
+        </w:rPr>
+        <w:t xml:space="preserve"> An agent = a </w:t>
+      </w:r>
+      <w:r>
+        <w:rPr>
+          <w:b/>
+          <w:bCs/>
+          <w:color w:val="1A1A22"/>
+          <w:sz w:val="21"/>
+          <w:szCs w:val="21"/>
+          <w:rFonts w:ascii="Arial" w:cs="Arial" w:eastAsia="Arial" w:hAnsi="Arial"/>
+        </w:rPr>
+        <w:t xml:space="preserve">fixed engine</w:t>
+      </w:r>
+      <w:r>
+        <w:rPr>
+          <w:color w:val="1A1A22"/>
+          <w:sz w:val="21"/>
+          <w:szCs w:val="21"/>
+          <w:rFonts w:ascii="Arial" w:cs="Arial" w:eastAsia="Arial" w:hAnsi="Arial"/>
+        </w:rPr>
+        <w:t xml:space="preserve"> (the LLM, retrieval, tools, the loop) </w:t>
+      </w:r>
+      <w:r>
+        <w:rPr>
+          <w:b/>
+          <w:bCs/>
+          <w:color w:val="1A1A22"/>
+          <w:sz w:val="21"/>
+          <w:szCs w:val="21"/>
+          <w:rFonts w:ascii="Arial" w:cs="Arial" w:eastAsia="Arial" w:hAnsi="Arial"/>
+        </w:rPr>
+        <w:t xml:space="preserve">+ a Playbook</w:t>
+      </w:r>
+      <w:r>
+        <w:rPr>
+          <w:color w:val="1A1A22"/>
+          <w:sz w:val="21"/>
+          <w:szCs w:val="21"/>
+          <w:rFonts w:ascii="Arial" w:cs="Arial" w:eastAsia="Arial" w:hAnsi="Arial"/>
+        </w:rPr>
+        <w:t xml:space="preserve"> (a config artifact: system prompt + directives + exemplars + “watch-out” lessons). Parent and child share the </w:t>
       </w:r>
       <w:r>
         <w:rPr>
@@ -624,162 +610,29 @@
           <w:szCs w:val="21"/>
           <w:rFonts w:ascii="Arial" w:cs="Arial" w:eastAsia="Arial" w:hAnsi="Arial"/>
         </w:rPr>
-        <w:t xml:space="preserve">not</w:t>
-      </w:r>
-      <w:r>
-        <w:rPr>
-          <w:color w:val="1A1A22"/>
-          <w:sz w:val="21"/>
-          <w:szCs w:val="21"/>
-          <w:rFonts w:ascii="Arial" w:cs="Arial" w:eastAsia="Arial" w:hAnsi="Arial"/>
-        </w:rPr>
-        <w:t xml:space="preserve"> fine-tuning. The consequences map directly to real-world constraints:</w:t>
+        <w:t xml:space="preserve">exact same engine</w:t>
+      </w:r>
+      <w:r>
+        <w:rPr>
+          <w:color w:val="1A1A22"/>
+          <w:sz w:val="21"/>
+          <w:szCs w:val="21"/>
+          <w:rFonts w:ascii="Arial" w:cs="Arial" w:eastAsia="Arial" w:hAnsi="Arial"/>
+        </w:rPr>
+        <w:t xml:space="preserve"> — the only difference between them is the Playbook.</w:t>
       </w:r>
     </w:p>
     <w:p>
       <w:pPr>
-        <w:pStyle w:val="ListParagraph"/>
-        <w:numPr>
-          <w:ilvl w:val="0"/>
-          <w:numId w:val="2"/>
-        </w:numPr>
-        <w:spacing w:after="60" w:line="264"/>
-      </w:pPr>
-      <w:r>
-        <w:rPr>
-          <w:b/>
-          <w:bCs/>
-          <w:color w:val="1A1A22"/>
-          <w:sz w:val="21"/>
-          <w:szCs w:val="21"/>
-          <w:rFonts w:ascii="Arial" w:cs="Arial" w:eastAsia="Arial" w:hAnsi="Arial"/>
-        </w:rPr>
-        <w:t xml:space="preserve">Works on closed-source LLMs.  </w:t>
-      </w:r>
-      <w:r>
-        <w:rPr>
-          <w:color w:val="1A1A22"/>
-          <w:sz w:val="21"/>
-          <w:szCs w:val="21"/>
-          <w:rFonts w:ascii="Arial" w:cs="Arial" w:eastAsia="Arial" w:hAnsi="Arial"/>
-        </w:rPr>
-        <w:t xml:space="preserve">You can’t fine-tune Seed-2.0 or DeepSeek — but you can change how they’re prompted and what examples and lessons they’re given.</w:t>
-      </w:r>
-    </w:p>
-    <w:p>
-      <w:pPr>
-        <w:pStyle w:val="ListParagraph"/>
-        <w:numPr>
-          <w:ilvl w:val="0"/>
-          <w:numId w:val="2"/>
-        </w:numPr>
-        <w:spacing w:after="60" w:line="264"/>
-      </w:pPr>
-      <w:r>
-        <w:rPr>
-          <w:b/>
-          <w:bCs/>
-          <w:color w:val="1A1A22"/>
-          <w:sz w:val="21"/>
-          <w:szCs w:val="21"/>
-          <w:rFonts w:ascii="Arial" w:cs="Arial" w:eastAsia="Arial" w:hAnsi="Arial"/>
-        </w:rPr>
-        <w:t xml:space="preserve">Attributable.  </w:t>
-      </w:r>
-      <w:r>
-        <w:rPr>
-          <w:color w:val="1A1A22"/>
-          <w:sz w:val="21"/>
-          <w:szCs w:val="21"/>
-          <w:rFonts w:ascii="Arial" w:cs="Arial" w:eastAsia="Arial" w:hAnsi="Arial"/>
-        </w:rPr>
-        <w:t xml:space="preserve">Every lesson traces back to the trajectories that produced it.</w:t>
-      </w:r>
-    </w:p>
-    <w:p>
-      <w:pPr>
-        <w:pStyle w:val="ListParagraph"/>
-        <w:numPr>
-          <w:ilvl w:val="0"/>
-          <w:numId w:val="2"/>
-        </w:numPr>
-        <w:spacing w:after="60" w:line="264"/>
-      </w:pPr>
-      <w:r>
-        <w:rPr>
-          <w:b/>
-          <w:bCs/>
-          <w:color w:val="1A1A22"/>
-          <w:sz w:val="21"/>
-          <w:szCs w:val="21"/>
-          <w:rFonts w:ascii="Arial" w:cs="Arial" w:eastAsia="Arial" w:hAnsi="Arial"/>
-        </w:rPr>
-        <w:t xml:space="preserve">Reversible.  </w:t>
-      </w:r>
-      <w:r>
-        <w:rPr>
-          <w:color w:val="1A1A22"/>
-          <w:sz w:val="21"/>
-          <w:szCs w:val="21"/>
-          <w:rFonts w:ascii="Arial" w:cs="Arial" w:eastAsia="Arial" w:hAnsi="Arial"/>
-        </w:rPr>
-        <w:t xml:space="preserve">A bad promotion is one config swap to undo — no opaque weight changes.</w:t>
-      </w:r>
-    </w:p>
-    <w:p>
-      <w:pPr>
-        <w:pStyle w:val="Heading1"/>
-      </w:pPr>
-      <w:r>
-        <w:rPr>
-          <w:rFonts w:ascii="Arial" w:cs="Arial" w:eastAsia="Arial" w:hAnsi="Arial"/>
-        </w:rPr>
-        <w:t xml:space="preserve">3.  The closed loop</w:t>
-      </w:r>
-    </w:p>
-    <w:p>
-      <w:pPr>
-        <w:spacing w:after="120" w:line="276"/>
-      </w:pPr>
-      <w:r>
-        <w:rPr>
-          <w:color w:val="1A1A22"/>
-          <w:sz w:val="21"/>
-          <w:szCs w:val="21"/>
-          <w:rFonts w:ascii="Arial" w:cs="Arial" w:eastAsia="Arial" w:hAnsi="Arial"/>
-        </w:rPr>
-        <w:t xml:space="preserve">Each stage below is implemented; the path from parent run → distilled lesson → memory → child retrieval is verified live (</w:t>
-      </w:r>
-      <w:r>
-        <w:rPr>
-          <w:color w:val="33336A"/>
-          <w:sz w:val="19"/>
-          <w:szCs w:val="19"/>
-          <w:rFonts w:ascii="Consolas" w:cs="Consolas" w:eastAsia="Consolas" w:hAnsi="Consolas"/>
-        </w:rPr>
-        <w:t xml:space="preserve">scripts/demo_byteplus_loop.py</w:t>
-      </w:r>
-      <w:r>
-        <w:rPr>
-          <w:color w:val="1A1A22"/>
-          <w:sz w:val="21"/>
-          <w:szCs w:val="21"/>
-          <w:rFonts w:ascii="Arial" w:cs="Arial" w:eastAsia="Arial" w:hAnsi="Arial"/>
-        </w:rPr>
-        <w:t xml:space="preserve">), where a distilled child won 65–85% of head-to-head comparisons against a real BytePlus support agent.</w:t>
-      </w:r>
-    </w:p>
-    <w:p>
-      <w:pPr>
         <w:spacing w:before="120" w:after="60"/>
         <w:jc w:val="center"/>
       </w:pPr>
       <w:r>
         <w:drawing>
           <wp:inline distT="0" distB="0" distL="0" distR="0">
-            <wp:extent cx="5943600" cy="2476500"/>
+            <wp:extent cx="5715000" cy="4286250"/>
             <wp:effectExtent t="0" r="0" b="0" l="0"/>
-            <wp:docPr id="1" name="fig2-loop.png" descr="Figure 2 — observe → label → distill → evaluate → promote. The dashed arrow is the only write back to the live agent (a gated config swap)." title="Figure 2 — observe → label → distill → evaluate → promote. The dashed arrow is the only write back to the live agent (a gated config swap)."/>
+            <wp:docPr id="1" name="fig1-child.png" descr="Figure 1 — The parent and child share one engine. Only the Playbook differs; promotion swaps it." title="Figure 1 — The parent and child share one engine. Only the P"/>
             <wp:cNvGraphicFramePr>
               <a:graphicFrameLocks xmlns:a="http://schemas.openxmlformats.org/drawingml/2006/main" noChangeAspect="1"/>
             </wp:cNvGraphicFramePr>
@@ -802,7 +655,7 @@
                   <pic:spPr bwMode="auto">
                     <a:xfrm>
                       <a:off x="0" y="0"/>
-                      <a:ext cx="5943600" cy="2476500"/>
+                      <a:ext cx="5715000" cy="4286250"/>
                     </a:xfrm>
                     <a:prstGeom prst="rect">
                       <a:avLst/>
@@ -829,468 +682,72 @@
           <w:szCs w:val="17"/>
           <w:rFonts w:ascii="Arial" w:cs="Arial" w:eastAsia="Arial" w:hAnsi="Arial"/>
         </w:rPr>
-        <w:t xml:space="preserve">Figure 2 — observe → label → distill → evaluate → promote. The dashed arrow is the only write back to the live agent (a gated config swap).</w:t>
-      </w:r>
-    </w:p>
-    <w:tbl>
-      <w:tblPr>
-        <w:tblW w:type="dxa" w:w="9360"/>
-        <w:tblBorders>
-          <w:top w:val="single" w:color="auto" w:sz="4"/>
-          <w:left w:val="single" w:color="auto" w:sz="4"/>
-          <w:bottom w:val="single" w:color="auto" w:sz="4"/>
-          <w:right w:val="single" w:color="auto" w:sz="4"/>
-          <w:insideH w:val="single" w:color="auto" w:sz="4"/>
-          <w:insideV w:val="single" w:color="auto" w:sz="4"/>
-        </w:tblBorders>
-      </w:tblPr>
-      <w:tblGrid>
-        <w:gridCol w:w="2200"/>
-        <w:gridCol w:w="7160"/>
-      </w:tblGrid>
-      <w:tr>
-        <w:trPr>
-          <w:tblHeader/>
-        </w:trPr>
-        <w:tc>
-          <w:tcPr>
-            <w:tcW w:type="dxa" w:w="2200"/>
-            <w:tcBorders>
-              <w:top w:val="single" w:color="D9D9E0" w:sz="1"/>
-              <w:left w:val="single" w:color="D9D9E0" w:sz="1"/>
-              <w:bottom w:val="single" w:color="D9D9E0" w:sz="1"/>
-              <w:right w:val="single" w:color="D9D9E0" w:sz="1"/>
-            </w:tcBorders>
-            <w:shd w:fill="EEF0FB" w:val="clear"/>
-            <w:tcMar>
-              <w:top w:type="dxa" w:w="60"/>
-              <w:left w:type="dxa" w:w="120"/>
-              <w:bottom w:type="dxa" w:w="60"/>
-              <w:right w:type="dxa" w:w="120"/>
-            </w:tcMar>
-          </w:tcPr>
-          <w:p>
-            <w:pPr>
-              <w:spacing w:after="0" w:line="252"/>
-            </w:pPr>
-            <w:r>
-              <w:rPr>
-                <w:b/>
-                <w:bCs/>
-                <w:color w:val="1A1A22"/>
-                <w:sz w:val="18"/>
-                <w:szCs w:val="18"/>
-                <w:rFonts w:ascii="Arial" w:cs="Arial" w:eastAsia="Arial" w:hAnsi="Arial"/>
-              </w:rPr>
-              <w:t xml:space="preserve">Cadence</w:t>
-            </w:r>
-          </w:p>
-        </w:tc>
-        <w:tc>
-          <w:tcPr>
-            <w:tcW w:type="dxa" w:w="7160"/>
-            <w:tcBorders>
-              <w:top w:val="single" w:color="D9D9E0" w:sz="1"/>
-              <w:left w:val="single" w:color="D9D9E0" w:sz="1"/>
-              <w:bottom w:val="single" w:color="D9D9E0" w:sz="1"/>
-              <w:right w:val="single" w:color="D9D9E0" w:sz="1"/>
-            </w:tcBorders>
-            <w:shd w:fill="EEF0FB" w:val="clear"/>
-            <w:tcMar>
-              <w:top w:type="dxa" w:w="60"/>
-              <w:left w:type="dxa" w:w="120"/>
-              <w:bottom w:type="dxa" w:w="60"/>
-              <w:right w:type="dxa" w:w="120"/>
-            </w:tcMar>
-          </w:tcPr>
-          <w:p>
-            <w:pPr>
-              <w:spacing w:after="0" w:line="252"/>
-            </w:pPr>
-            <w:r>
-              <w:rPr>
-                <w:b/>
-                <w:bCs/>
-                <w:color w:val="1A1A22"/>
-                <w:sz w:val="18"/>
-                <w:szCs w:val="18"/>
-                <w:rFonts w:ascii="Arial" w:cs="Arial" w:eastAsia="Arial" w:hAnsi="Arial"/>
-              </w:rPr>
-              <w:t xml:space="preserve">What runs</w:t>
-            </w:r>
-          </w:p>
-        </w:tc>
-      </w:tr>
-      <w:tr>
-        <w:tc>
-          <w:tcPr>
-            <w:tcW w:type="dxa" w:w="2200"/>
-            <w:tcBorders>
-              <w:top w:val="single" w:color="D9D9E0" w:sz="1"/>
-              <w:left w:val="single" w:color="D9D9E0" w:sz="1"/>
-              <w:bottom w:val="single" w:color="D9D9E0" w:sz="1"/>
-              <w:right w:val="single" w:color="D9D9E0" w:sz="1"/>
-            </w:tcBorders>
-            <w:tcMar>
-              <w:top w:type="dxa" w:w="60"/>
-              <w:left w:type="dxa" w:w="120"/>
-              <w:bottom w:type="dxa" w:w="60"/>
-              <w:right w:type="dxa" w:w="120"/>
-            </w:tcMar>
-          </w:tcPr>
-          <w:p>
-            <w:pPr>
-              <w:spacing w:after="0" w:line="252"/>
-            </w:pPr>
-            <w:r>
-              <w:rPr>
-                <w:b w:val="false"/>
-                <w:bCs w:val="false"/>
-                <w:color w:val="1A1A22"/>
-                <w:sz w:val="18"/>
-                <w:szCs w:val="18"/>
-                <w:rFonts w:ascii="Arial" w:cs="Arial" w:eastAsia="Arial" w:hAnsi="Arial"/>
-              </w:rPr>
-              <w:t xml:space="preserve">Continuous (ms)</w:t>
-            </w:r>
-          </w:p>
-        </w:tc>
-        <w:tc>
-          <w:tcPr>
-            <w:tcW w:type="dxa" w:w="7160"/>
-            <w:tcBorders>
-              <w:top w:val="single" w:color="D9D9E0" w:sz="1"/>
-              <w:left w:val="single" w:color="D9D9E0" w:sz="1"/>
-              <w:bottom w:val="single" w:color="D9D9E0" w:sz="1"/>
-              <w:right w:val="single" w:color="D9D9E0" w:sz="1"/>
-            </w:tcBorders>
-            <w:tcMar>
-              <w:top w:type="dxa" w:w="60"/>
-              <w:left w:type="dxa" w:w="120"/>
-              <w:bottom w:type="dxa" w:w="60"/>
-              <w:right w:type="dxa" w:w="120"/>
-            </w:tcMar>
-          </w:tcPr>
-          <w:p>
-            <w:pPr>
-              <w:spacing w:after="0" w:line="252"/>
-            </w:pPr>
-            <w:r>
-              <w:rPr>
-                <w:b w:val="false"/>
-                <w:bCs w:val="false"/>
-                <w:color w:val="1A1A22"/>
-                <w:sz w:val="18"/>
-                <w:szCs w:val="18"/>
-                <w:rFonts w:ascii="Arial" w:cs="Arial" w:eastAsia="Arial" w:hAnsi="Arial"/>
-              </w:rPr>
-              <w:t xml:space="preserve">Tap captures live interactions into the trajectory store — async, fail-open, never on the user’s response path.</w:t>
-            </w:r>
-          </w:p>
-        </w:tc>
-      </w:tr>
-      <w:tr>
-        <w:tc>
-          <w:tcPr>
-            <w:tcW w:type="dxa" w:w="2200"/>
-            <w:tcBorders>
-              <w:top w:val="single" w:color="D9D9E0" w:sz="1"/>
-              <w:left w:val="single" w:color="D9D9E0" w:sz="1"/>
-              <w:bottom w:val="single" w:color="D9D9E0" w:sz="1"/>
-              <w:right w:val="single" w:color="D9D9E0" w:sz="1"/>
-            </w:tcBorders>
-            <w:tcMar>
-              <w:top w:type="dxa" w:w="60"/>
-              <w:left w:type="dxa" w:w="120"/>
-              <w:bottom w:type="dxa" w:w="60"/>
-              <w:right w:type="dxa" w:w="120"/>
-            </w:tcMar>
-          </w:tcPr>
-          <w:p>
-            <w:pPr>
-              <w:spacing w:after="0" w:line="252"/>
-            </w:pPr>
-            <w:r>
-              <w:rPr>
-                <w:b w:val="false"/>
-                <w:bCs w:val="false"/>
-                <w:color w:val="1A1A22"/>
-                <w:sz w:val="18"/>
-                <w:szCs w:val="18"/>
-                <w:rFonts w:ascii="Arial" w:cs="Arial" w:eastAsia="Arial" w:hAnsi="Arial"/>
-              </w:rPr>
-              <w:t xml:space="preserve">Hourly</w:t>
-            </w:r>
-          </w:p>
-        </w:tc>
-        <w:tc>
-          <w:tcPr>
-            <w:tcW w:type="dxa" w:w="7160"/>
-            <w:tcBorders>
-              <w:top w:val="single" w:color="D9D9E0" w:sz="1"/>
-              <w:left w:val="single" w:color="D9D9E0" w:sz="1"/>
-              <w:bottom w:val="single" w:color="D9D9E0" w:sz="1"/>
-              <w:right w:val="single" w:color="D9D9E0" w:sz="1"/>
-            </w:tcBorders>
-            <w:tcMar>
-              <w:top w:type="dxa" w:w="60"/>
-              <w:left w:type="dxa" w:w="120"/>
-              <w:bottom w:type="dxa" w:w="60"/>
-              <w:right w:type="dxa" w:w="120"/>
-            </w:tcMar>
-          </w:tcPr>
-          <w:p>
-            <w:pPr>
-              <w:spacing w:after="0" w:line="252"/>
-            </w:pPr>
-            <w:r>
-              <w:rPr>
-                <w:b w:val="false"/>
-                <w:bCs w:val="false"/>
-                <w:color w:val="1A1A22"/>
-                <w:sz w:val="18"/>
-                <w:szCs w:val="18"/>
-                <w:rFonts w:ascii="Arial" w:cs="Arial" w:eastAsia="Arial" w:hAnsi="Arial"/>
-              </w:rPr>
-              <w:t xml:space="preserve">Judge + outcome scoring label the trajectories.</w:t>
-            </w:r>
-          </w:p>
-        </w:tc>
-      </w:tr>
-      <w:tr>
-        <w:tc>
-          <w:tcPr>
-            <w:tcW w:type="dxa" w:w="2200"/>
-            <w:tcBorders>
-              <w:top w:val="single" w:color="D9D9E0" w:sz="1"/>
-              <w:left w:val="single" w:color="D9D9E0" w:sz="1"/>
-              <w:bottom w:val="single" w:color="D9D9E0" w:sz="1"/>
-              <w:right w:val="single" w:color="D9D9E0" w:sz="1"/>
-            </w:tcBorders>
-            <w:tcMar>
-              <w:top w:type="dxa" w:w="60"/>
-              <w:left w:type="dxa" w:w="120"/>
-              <w:bottom w:type="dxa" w:w="60"/>
-              <w:right w:type="dxa" w:w="120"/>
-            </w:tcMar>
-          </w:tcPr>
-          <w:p>
-            <w:pPr>
-              <w:spacing w:after="0" w:line="252"/>
-            </w:pPr>
-            <w:r>
-              <w:rPr>
-                <w:b w:val="false"/>
-                <w:bCs w:val="false"/>
-                <w:color w:val="1A1A22"/>
-                <w:sz w:val="18"/>
-                <w:szCs w:val="18"/>
-                <w:rFonts w:ascii="Arial" w:cs="Arial" w:eastAsia="Arial" w:hAnsi="Arial"/>
-              </w:rPr>
-              <w:t xml:space="preserve">Nightly (batch)</w:t>
-            </w:r>
-          </w:p>
-        </w:tc>
-        <w:tc>
-          <w:tcPr>
-            <w:tcW w:type="dxa" w:w="7160"/>
-            <w:tcBorders>
-              <w:top w:val="single" w:color="D9D9E0" w:sz="1"/>
-              <w:left w:val="single" w:color="D9D9E0" w:sz="1"/>
-              <w:bottom w:val="single" w:color="D9D9E0" w:sz="1"/>
-              <w:right w:val="single" w:color="D9D9E0" w:sz="1"/>
-            </w:tcBorders>
-            <w:tcMar>
-              <w:top w:type="dxa" w:w="60"/>
-              <w:left w:type="dxa" w:w="120"/>
-              <w:bottom w:type="dxa" w:w="60"/>
-              <w:right w:type="dxa" w:w="120"/>
-            </w:tcMar>
-          </w:tcPr>
-          <w:p>
-            <w:pPr>
-              <w:spacing w:after="0" w:line="252"/>
-            </w:pPr>
-            <w:r>
-              <w:rPr>
-                <w:b w:val="false"/>
-                <w:bCs w:val="false"/>
-                <w:color w:val="1A1A22"/>
-                <w:sz w:val="18"/>
-                <w:szCs w:val="18"/>
-                <w:rFonts w:ascii="Arial" w:cs="Arial" w:eastAsia="Arial" w:hAnsi="Arial"/>
-              </w:rPr>
-              <w:t xml:space="preserve">Distill lessons → build child G(n+1) → run the gate on a held-out set.</w:t>
-            </w:r>
-          </w:p>
-        </w:tc>
-      </w:tr>
-      <w:tr>
-        <w:tc>
-          <w:tcPr>
-            <w:tcW w:type="dxa" w:w="2200"/>
-            <w:tcBorders>
-              <w:top w:val="single" w:color="D9D9E0" w:sz="1"/>
-              <w:left w:val="single" w:color="D9D9E0" w:sz="1"/>
-              <w:bottom w:val="single" w:color="D9D9E0" w:sz="1"/>
-              <w:right w:val="single" w:color="D9D9E0" w:sz="1"/>
-            </w:tcBorders>
-            <w:tcMar>
-              <w:top w:type="dxa" w:w="60"/>
-              <w:left w:type="dxa" w:w="120"/>
-              <w:bottom w:type="dxa" w:w="60"/>
-              <w:right w:type="dxa" w:w="120"/>
-            </w:tcMar>
-          </w:tcPr>
-          <w:p>
-            <w:pPr>
-              <w:spacing w:after="0" w:line="252"/>
-            </w:pPr>
-            <w:r>
-              <w:rPr>
-                <w:b w:val="false"/>
-                <w:bCs w:val="false"/>
-                <w:color w:val="1A1A22"/>
-                <w:sz w:val="18"/>
-                <w:szCs w:val="18"/>
-                <w:rFonts w:ascii="Arial" w:cs="Arial" w:eastAsia="Arial" w:hAnsi="Arial"/>
-              </w:rPr>
-              <w:t xml:space="preserve">Weekly (human)</w:t>
-            </w:r>
-          </w:p>
-        </w:tc>
-        <w:tc>
-          <w:tcPr>
-            <w:tcW w:type="dxa" w:w="7160"/>
-            <w:tcBorders>
-              <w:top w:val="single" w:color="D9D9E0" w:sz="1"/>
-              <w:left w:val="single" w:color="D9D9E0" w:sz="1"/>
-              <w:bottom w:val="single" w:color="D9D9E0" w:sz="1"/>
-              <w:right w:val="single" w:color="D9D9E0" w:sz="1"/>
-            </w:tcBorders>
-            <w:tcMar>
-              <w:top w:type="dxa" w:w="60"/>
-              <w:left w:type="dxa" w:w="120"/>
-              <w:bottom w:type="dxa" w:w="60"/>
-              <w:right w:type="dxa" w:w="120"/>
-            </w:tcMar>
-          </w:tcPr>
-          <w:p>
-            <w:pPr>
-              <w:spacing w:after="0" w:line="252"/>
-            </w:pPr>
-            <w:r>
-              <w:rPr>
-                <w:b w:val="false"/>
-                <w:bCs w:val="false"/>
-                <w:color w:val="1A1A22"/>
-                <w:sz w:val="18"/>
-                <w:szCs w:val="18"/>
-                <w:rFonts w:ascii="Arial" w:cs="Arial" w:eastAsia="Arial" w:hAnsi="Arial"/>
-              </w:rPr>
-              <w:t xml:space="preserve">Reviewer sees the diff + metrics in the dashboard → clicks Promote.</w:t>
-            </w:r>
-          </w:p>
-        </w:tc>
-      </w:tr>
-      <w:tr>
-        <w:tc>
-          <w:tcPr>
-            <w:tcW w:type="dxa" w:w="2200"/>
-            <w:tcBorders>
-              <w:top w:val="single" w:color="D9D9E0" w:sz="1"/>
-              <w:left w:val="single" w:color="D9D9E0" w:sz="1"/>
-              <w:bottom w:val="single" w:color="D9D9E0" w:sz="1"/>
-              <w:right w:val="single" w:color="D9D9E0" w:sz="1"/>
-            </w:tcBorders>
-            <w:tcMar>
-              <w:top w:type="dxa" w:w="60"/>
-              <w:left w:type="dxa" w:w="120"/>
-              <w:bottom w:type="dxa" w:w="60"/>
-              <w:right w:type="dxa" w:w="120"/>
-            </w:tcMar>
-          </w:tcPr>
-          <w:p>
-            <w:pPr>
-              <w:spacing w:after="0" w:line="252"/>
-            </w:pPr>
-            <w:r>
-              <w:rPr>
-                <w:b w:val="false"/>
-                <w:bCs w:val="false"/>
-                <w:color w:val="1A1A22"/>
-                <w:sz w:val="18"/>
-                <w:szCs w:val="18"/>
-                <w:rFonts w:ascii="Arial" w:cs="Arial" w:eastAsia="Arial" w:hAnsi="Arial"/>
-              </w:rPr>
-              <w:t xml:space="preserve">On regression</w:t>
-            </w:r>
-          </w:p>
-        </w:tc>
-        <w:tc>
-          <w:tcPr>
-            <w:tcW w:type="dxa" w:w="7160"/>
-            <w:tcBorders>
-              <w:top w:val="single" w:color="D9D9E0" w:sz="1"/>
-              <w:left w:val="single" w:color="D9D9E0" w:sz="1"/>
-              <w:bottom w:val="single" w:color="D9D9E0" w:sz="1"/>
-              <w:right w:val="single" w:color="D9D9E0" w:sz="1"/>
-            </w:tcBorders>
-            <w:tcMar>
-              <w:top w:type="dxa" w:w="60"/>
-              <w:left w:type="dxa" w:w="120"/>
-              <w:bottom w:type="dxa" w:w="60"/>
-              <w:right w:type="dxa" w:w="120"/>
-            </w:tcMar>
-          </w:tcPr>
-          <w:p>
-            <w:pPr>
-              <w:spacing w:after="0" w:line="252"/>
-            </w:pPr>
-            <w:r>
-              <w:rPr>
-                <w:b w:val="false"/>
-                <w:bCs w:val="false"/>
-                <w:color w:val="1A1A22"/>
-                <w:sz w:val="18"/>
-                <w:szCs w:val="18"/>
-                <w:rFonts w:ascii="Arial" w:cs="Arial" w:eastAsia="Arial" w:hAnsi="Arial"/>
-              </w:rPr>
-              <w:t xml:space="preserve">One-click rollback, or auto-rollback if a live metric degrades after promotion.</w:t>
-            </w:r>
-          </w:p>
-        </w:tc>
-      </w:tr>
-    </w:tbl>
-    <w:p>
-      <w:r>
-        <w:br w:type="page"/>
+        <w:t xml:space="preserve">Figure 1 — The parent and child share one engine. Only the Playbook differs; promotion swaps it.</w:t>
       </w:r>
     </w:p>
     <w:p>
       <w:pPr>
-        <w:pStyle w:val="Heading1"/>
-      </w:pPr>
-      <w:r>
-        <w:rPr>
-          <w:rFonts w:ascii="Arial" w:cs="Arial" w:eastAsia="Arial" w:hAnsi="Arial"/>
-        </w:rPr>
-        <w:t xml:space="preserve">4.  Production integration</w:t>
+        <w:spacing w:after="120" w:line="276"/>
+      </w:pPr>
+      <w:r>
+        <w:rPr>
+          <w:color w:val="1A1A22"/>
+          <w:sz w:val="21"/>
+          <w:szCs w:val="21"/>
+          <w:rFonts w:ascii="Arial" w:cs="Arial" w:eastAsia="Arial" w:hAnsi="Arial"/>
+        </w:rPr>
+        <w:t xml:space="preserve">This is the </w:t>
+      </w:r>
+      <w:r>
+        <w:rPr>
+          <w:b/>
+          <w:bCs/>
+          <w:color w:val="1A1A22"/>
+          <w:sz w:val="21"/>
+          <w:szCs w:val="21"/>
+          <w:rFonts w:ascii="Arial" w:cs="Arial" w:eastAsia="Arial" w:hAnsi="Arial"/>
+        </w:rPr>
+        <w:t xml:space="preserve">Phase-1 mechanism</w:t>
+      </w:r>
+      <w:r>
+        <w:rPr>
+          <w:color w:val="1A1A22"/>
+          <w:sz w:val="21"/>
+          <w:szCs w:val="21"/>
+          <w:rFonts w:ascii="Arial" w:cs="Arial" w:eastAsia="Arial" w:hAnsi="Arial"/>
+        </w:rPr>
+        <w:t xml:space="preserve">: playbook distillation, </w:t>
+      </w:r>
+      <w:r>
+        <w:rPr>
+          <w:i/>
+          <w:iCs/>
+          <w:color w:val="1A1A22"/>
+          <w:sz w:val="21"/>
+          <w:szCs w:val="21"/>
+          <w:rFonts w:ascii="Arial" w:cs="Arial" w:eastAsia="Arial" w:hAnsi="Arial"/>
+        </w:rPr>
+        <w:t xml:space="preserve">not</w:t>
+      </w:r>
+      <w:r>
+        <w:rPr>
+          <w:color w:val="1A1A22"/>
+          <w:sz w:val="21"/>
+          <w:szCs w:val="21"/>
+          <w:rFonts w:ascii="Arial" w:cs="Arial" w:eastAsia="Arial" w:hAnsi="Arial"/>
+        </w:rPr>
+        <w:t xml:space="preserve"> fine-tuning. The consequences map directly to real-world constraints:</w:t>
       </w:r>
     </w:p>
     <w:p>
       <w:pPr>
-        <w:spacing w:after="120" w:line="276"/>
-      </w:pPr>
-      <w:r>
-        <w:rPr>
-          <w:color w:val="1A1A22"/>
-          <w:sz w:val="21"/>
-          <w:szCs w:val="21"/>
-          <w:rFonts w:ascii="Arial" w:cs="Arial" w:eastAsia="Arial" w:hAnsi="Arial"/>
-        </w:rPr>
-        <w:t xml:space="preserve">aprntc sits </w:t>
-      </w:r>
+        <w:pStyle w:val="ListParagraph"/>
+        <w:numPr>
+          <w:ilvl w:val="0"/>
+          <w:numId w:val="2"/>
+        </w:numPr>
+        <w:spacing w:after="60" w:line="264"/>
+      </w:pPr>
       <w:r>
         <w:rPr>
           <w:b/>
@@ -1300,17 +757,27 @@
           <w:szCs w:val="21"/>
           <w:rFonts w:ascii="Arial" w:cs="Arial" w:eastAsia="Arial" w:hAnsi="Arial"/>
         </w:rPr>
-        <w:t xml:space="preserve">beside</w:t>
-      </w:r>
-      <w:r>
-        <w:rPr>
-          <w:color w:val="1A1A22"/>
-          <w:sz w:val="21"/>
-          <w:szCs w:val="21"/>
-          <w:rFonts w:ascii="Arial" w:cs="Arial" w:eastAsia="Arial" w:hAnsi="Arial"/>
-        </w:rPr>
-        <w:t xml:space="preserve"> your agent, never in front of it. The production agent keeps running exactly as today; aprntc is a separate service that observes, improves, and proposes. It is </w:t>
-      </w:r>
+        <w:t xml:space="preserve">Works on closed-source LLMs.  </w:t>
+      </w:r>
+      <w:r>
+        <w:rPr>
+          <w:color w:val="1A1A22"/>
+          <w:sz w:val="21"/>
+          <w:szCs w:val="21"/>
+          <w:rFonts w:ascii="Arial" w:cs="Arial" w:eastAsia="Arial" w:hAnsi="Arial"/>
+        </w:rPr>
+        <w:t xml:space="preserve">You can’t fine-tune Seed-2.0 or DeepSeek — but you can change how they’re prompted and what examples and lessons they’re given.</w:t>
+      </w:r>
+    </w:p>
+    <w:p>
+      <w:pPr>
+        <w:pStyle w:val="ListParagraph"/>
+        <w:numPr>
+          <w:ilvl w:val="0"/>
+          <w:numId w:val="2"/>
+        </w:numPr>
+        <w:spacing w:after="60" w:line="264"/>
+      </w:pPr>
       <w:r>
         <w:rPr>
           <w:b/>
@@ -1320,29 +787,102 @@
           <w:szCs w:val="21"/>
           <w:rFonts w:ascii="Arial" w:cs="Arial" w:eastAsia="Arial" w:hAnsi="Arial"/>
         </w:rPr>
-        <w:t xml:space="preserve">never in the user request path</w:t>
-      </w:r>
-      <w:r>
-        <w:rPr>
-          <w:color w:val="1A1A22"/>
-          <w:sz w:val="21"/>
-          <w:szCs w:val="21"/>
-          <w:rFonts w:ascii="Arial" w:cs="Arial" w:eastAsia="Arial" w:hAnsi="Arial"/>
-        </w:rPr>
-        <w:t xml:space="preserve"> — if it’s down or wrong, production is unaffected.</w:t>
+        <w:t xml:space="preserve">Attributable.  </w:t>
+      </w:r>
+      <w:r>
+        <w:rPr>
+          <w:color w:val="1A1A22"/>
+          <w:sz w:val="21"/>
+          <w:szCs w:val="21"/>
+          <w:rFonts w:ascii="Arial" w:cs="Arial" w:eastAsia="Arial" w:hAnsi="Arial"/>
+        </w:rPr>
+        <w:t xml:space="preserve">Every lesson traces back to the trajectories that produced it.</w:t>
       </w:r>
     </w:p>
     <w:p>
       <w:pPr>
+        <w:pStyle w:val="ListParagraph"/>
+        <w:numPr>
+          <w:ilvl w:val="0"/>
+          <w:numId w:val="2"/>
+        </w:numPr>
+        <w:spacing w:after="60" w:line="264"/>
+      </w:pPr>
+      <w:r>
+        <w:rPr>
+          <w:b/>
+          <w:bCs/>
+          <w:color w:val="1A1A22"/>
+          <w:sz w:val="21"/>
+          <w:szCs w:val="21"/>
+          <w:rFonts w:ascii="Arial" w:cs="Arial" w:eastAsia="Arial" w:hAnsi="Arial"/>
+        </w:rPr>
+        <w:t xml:space="preserve">Reversible.  </w:t>
+      </w:r>
+      <w:r>
+        <w:rPr>
+          <w:color w:val="1A1A22"/>
+          <w:sz w:val="21"/>
+          <w:szCs w:val="21"/>
+          <w:rFonts w:ascii="Arial" w:cs="Arial" w:eastAsia="Arial" w:hAnsi="Arial"/>
+        </w:rPr>
+        <w:t xml:space="preserve">A bad promotion is one config swap to undo — no opaque weight changes.</w:t>
+      </w:r>
+    </w:p>
+    <w:p>
+      <w:pPr>
+        <w:pStyle w:val="Heading1"/>
+      </w:pPr>
+      <w:r>
+        <w:rPr>
+          <w:rFonts w:ascii="Arial" w:cs="Arial" w:eastAsia="Arial" w:hAnsi="Arial"/>
+        </w:rPr>
+        <w:t xml:space="preserve">3.  The closed loop</w:t>
+      </w:r>
+    </w:p>
+    <w:p>
+      <w:pPr>
+        <w:spacing w:after="120" w:line="276"/>
+      </w:pPr>
+      <w:r>
+        <w:rPr>
+          <w:color w:val="1A1A22"/>
+          <w:sz w:val="21"/>
+          <w:szCs w:val="21"/>
+          <w:rFonts w:ascii="Arial" w:cs="Arial" w:eastAsia="Arial" w:hAnsi="Arial"/>
+        </w:rPr>
+        <w:t xml:space="preserve">Each stage below is implemented; the path from parent run → distilled lesson → memory → child retrieval is verified live (</w:t>
+      </w:r>
+      <w:r>
+        <w:rPr>
+          <w:color w:val="33336A"/>
+          <w:sz w:val="19"/>
+          <w:szCs w:val="19"/>
+          <w:rFonts w:ascii="Consolas" w:cs="Consolas" w:eastAsia="Consolas" w:hAnsi="Consolas"/>
+        </w:rPr>
+        <w:t xml:space="preserve">scripts/demo_byteplus_loop.py</w:t>
+      </w:r>
+      <w:r>
+        <w:rPr>
+          <w:color w:val="1A1A22"/>
+          <w:sz w:val="21"/>
+          <w:szCs w:val="21"/>
+          <w:rFonts w:ascii="Arial" w:cs="Arial" w:eastAsia="Arial" w:hAnsi="Arial"/>
+        </w:rPr>
+        <w:t xml:space="preserve">), where a distilled child won 65–85% of head-to-head comparisons against a real BytePlus support agent.</w:t>
+      </w:r>
+    </w:p>
+    <w:p>
+      <w:pPr>
         <w:spacing w:before="120" w:after="60"/>
         <w:jc w:val="center"/>
       </w:pPr>
       <w:r>
         <w:drawing>
           <wp:inline distT="0" distB="0" distL="0" distR="0">
-            <wp:extent cx="5943600" cy="3629025"/>
+            <wp:extent cx="5943600" cy="2476500"/>
             <wp:effectExtent t="0" r="0" b="0" l="0"/>
-            <wp:docPr id="1" name="fig3-production.png" descr="Figure 3 — aprntc observes via a read-only tap (inbound) and serves the improved playbook the agent pulls (outbound). The gated config swap is the only write back to production." title="Figure 3 — aprntc observes via a read-only tap (inbound) and serves the improved playbook the agent pulls (outbound). The gated config swap is the only write back to production."/>
+            <wp:docPr id="1" name="fig2-loop.png" descr="Figure 2 — observe → label → distill → evaluate → promote. The dashed arrow is the only write back to the live agent (a gated config swap)." title="Figure 2 — observe → label → distill → evaluate → promote. T"/>
             <wp:cNvGraphicFramePr>
               <a:graphicFrameLocks xmlns:a="http://schemas.openxmlformats.org/drawingml/2006/main" noChangeAspect="1"/>
             </wp:cNvGraphicFramePr>
@@ -1365,7 +905,7 @@
                   <pic:spPr bwMode="auto">
                     <a:xfrm>
                       <a:off x="0" y="0"/>
-                      <a:ext cx="5943600" cy="3629025"/>
+                      <a:ext cx="5943600" cy="2476500"/>
                     </a:xfrm>
                     <a:prstGeom prst="rect">
                       <a:avLst/>
@@ -1392,18 +932,453 @@
           <w:szCs w:val="17"/>
           <w:rFonts w:ascii="Arial" w:cs="Arial" w:eastAsia="Arial" w:hAnsi="Arial"/>
         </w:rPr>
-        <w:t xml:space="preserve">Figure 3 — aprntc observes via a read-only tap (inbound) and serves the improved playbook the agent pulls (outbound). The gated config swap is the only write back to production.</w:t>
+        <w:t xml:space="preserve">Figure 2 — observe → label → distill → evaluate → promote. The dashed arrow is the only write back to the live agent (a gated config swap).</w:t>
+      </w:r>
+    </w:p>
+    <w:tbl>
+      <w:tblPr>
+        <w:tblW w:type="dxa" w:w="9360"/>
+        <w:tblBorders>
+          <w:top w:val="single" w:color="auto" w:sz="4"/>
+          <w:left w:val="single" w:color="auto" w:sz="4"/>
+          <w:bottom w:val="single" w:color="auto" w:sz="4"/>
+          <w:right w:val="single" w:color="auto" w:sz="4"/>
+          <w:insideH w:val="single" w:color="auto" w:sz="4"/>
+          <w:insideV w:val="single" w:color="auto" w:sz="4"/>
+        </w:tblBorders>
+      </w:tblPr>
+      <w:tblGrid>
+        <w:gridCol w:w="2200"/>
+        <w:gridCol w:w="7160"/>
+      </w:tblGrid>
+      <w:tr>
+        <w:trPr>
+          <w:tblHeader/>
+        </w:trPr>
+        <w:tc>
+          <w:tcPr>
+            <w:tcW w:type="dxa" w:w="2200"/>
+            <w:tcBorders>
+              <w:top w:val="single" w:color="D9D9E0" w:sz="1"/>
+              <w:left w:val="single" w:color="D9D9E0" w:sz="1"/>
+              <w:bottom w:val="single" w:color="D9D9E0" w:sz="1"/>
+              <w:right w:val="single" w:color="D9D9E0" w:sz="1"/>
+            </w:tcBorders>
+            <w:shd w:fill="EEF0FB" w:val="clear"/>
+            <w:tcMar>
+              <w:top w:type="dxa" w:w="60"/>
+              <w:left w:type="dxa" w:w="120"/>
+              <w:bottom w:type="dxa" w:w="60"/>
+              <w:right w:type="dxa" w:w="120"/>
+            </w:tcMar>
+          </w:tcPr>
+          <w:p>
+            <w:pPr>
+              <w:spacing w:after="0" w:line="252"/>
+            </w:pPr>
+            <w:r>
+              <w:rPr>
+                <w:b/>
+                <w:bCs/>
+                <w:color w:val="1A1A22"/>
+                <w:sz w:val="18"/>
+                <w:szCs w:val="18"/>
+                <w:rFonts w:ascii="Arial" w:cs="Arial" w:eastAsia="Arial" w:hAnsi="Arial"/>
+              </w:rPr>
+              <w:t xml:space="preserve">Cadence</w:t>
+            </w:r>
+          </w:p>
+        </w:tc>
+        <w:tc>
+          <w:tcPr>
+            <w:tcW w:type="dxa" w:w="7160"/>
+            <w:tcBorders>
+              <w:top w:val="single" w:color="D9D9E0" w:sz="1"/>
+              <w:left w:val="single" w:color="D9D9E0" w:sz="1"/>
+              <w:bottom w:val="single" w:color="D9D9E0" w:sz="1"/>
+              <w:right w:val="single" w:color="D9D9E0" w:sz="1"/>
+            </w:tcBorders>
+            <w:shd w:fill="EEF0FB" w:val="clear"/>
+            <w:tcMar>
+              <w:top w:type="dxa" w:w="60"/>
+              <w:left w:type="dxa" w:w="120"/>
+              <w:bottom w:type="dxa" w:w="60"/>
+              <w:right w:type="dxa" w:w="120"/>
+            </w:tcMar>
+          </w:tcPr>
+          <w:p>
+            <w:pPr>
+              <w:spacing w:after="0" w:line="252"/>
+            </w:pPr>
+            <w:r>
+              <w:rPr>
+                <w:b/>
+                <w:bCs/>
+                <w:color w:val="1A1A22"/>
+                <w:sz w:val="18"/>
+                <w:szCs w:val="18"/>
+                <w:rFonts w:ascii="Arial" w:cs="Arial" w:eastAsia="Arial" w:hAnsi="Arial"/>
+              </w:rPr>
+              <w:t xml:space="preserve">What runs</w:t>
+            </w:r>
+          </w:p>
+        </w:tc>
+      </w:tr>
+      <w:tr>
+        <w:tc>
+          <w:tcPr>
+            <w:tcW w:type="dxa" w:w="2200"/>
+            <w:tcBorders>
+              <w:top w:val="single" w:color="D9D9E0" w:sz="1"/>
+              <w:left w:val="single" w:color="D9D9E0" w:sz="1"/>
+              <w:bottom w:val="single" w:color="D9D9E0" w:sz="1"/>
+              <w:right w:val="single" w:color="D9D9E0" w:sz="1"/>
+            </w:tcBorders>
+            <w:tcMar>
+              <w:top w:type="dxa" w:w="60"/>
+              <w:left w:type="dxa" w:w="120"/>
+              <w:bottom w:type="dxa" w:w="60"/>
+              <w:right w:type="dxa" w:w="120"/>
+            </w:tcMar>
+          </w:tcPr>
+          <w:p>
+            <w:pPr>
+              <w:spacing w:after="0" w:line="252"/>
+            </w:pPr>
+            <w:r>
+              <w:rPr>
+                <w:b w:val="false"/>
+                <w:bCs w:val="false"/>
+                <w:color w:val="1A1A22"/>
+                <w:sz w:val="18"/>
+                <w:szCs w:val="18"/>
+                <w:rFonts w:ascii="Arial" w:cs="Arial" w:eastAsia="Arial" w:hAnsi="Arial"/>
+              </w:rPr>
+              <w:t xml:space="preserve">Continuous (ms)</w:t>
+            </w:r>
+          </w:p>
+        </w:tc>
+        <w:tc>
+          <w:tcPr>
+            <w:tcW w:type="dxa" w:w="7160"/>
+            <w:tcBorders>
+              <w:top w:val="single" w:color="D9D9E0" w:sz="1"/>
+              <w:left w:val="single" w:color="D9D9E0" w:sz="1"/>
+              <w:bottom w:val="single" w:color="D9D9E0" w:sz="1"/>
+              <w:right w:val="single" w:color="D9D9E0" w:sz="1"/>
+            </w:tcBorders>
+            <w:tcMar>
+              <w:top w:type="dxa" w:w="60"/>
+              <w:left w:type="dxa" w:w="120"/>
+              <w:bottom w:type="dxa" w:w="60"/>
+              <w:right w:type="dxa" w:w="120"/>
+            </w:tcMar>
+          </w:tcPr>
+          <w:p>
+            <w:pPr>
+              <w:spacing w:after="0" w:line="252"/>
+            </w:pPr>
+            <w:r>
+              <w:rPr>
+                <w:b w:val="false"/>
+                <w:bCs w:val="false"/>
+                <w:color w:val="1A1A22"/>
+                <w:sz w:val="18"/>
+                <w:szCs w:val="18"/>
+                <w:rFonts w:ascii="Arial" w:cs="Arial" w:eastAsia="Arial" w:hAnsi="Arial"/>
+              </w:rPr>
+              <w:t xml:space="preserve">Tap captures live interactions into the trajectory store — async, fail-open, never on the user’s response path.</w:t>
+            </w:r>
+          </w:p>
+        </w:tc>
+      </w:tr>
+      <w:tr>
+        <w:tc>
+          <w:tcPr>
+            <w:tcW w:type="dxa" w:w="2200"/>
+            <w:tcBorders>
+              <w:top w:val="single" w:color="D9D9E0" w:sz="1"/>
+              <w:left w:val="single" w:color="D9D9E0" w:sz="1"/>
+              <w:bottom w:val="single" w:color="D9D9E0" w:sz="1"/>
+              <w:right w:val="single" w:color="D9D9E0" w:sz="1"/>
+            </w:tcBorders>
+            <w:tcMar>
+              <w:top w:type="dxa" w:w="60"/>
+              <w:left w:type="dxa" w:w="120"/>
+              <w:bottom w:type="dxa" w:w="60"/>
+              <w:right w:type="dxa" w:w="120"/>
+            </w:tcMar>
+          </w:tcPr>
+          <w:p>
+            <w:pPr>
+              <w:spacing w:after="0" w:line="252"/>
+            </w:pPr>
+            <w:r>
+              <w:rPr>
+                <w:b w:val="false"/>
+                <w:bCs w:val="false"/>
+                <w:color w:val="1A1A22"/>
+                <w:sz w:val="18"/>
+                <w:szCs w:val="18"/>
+                <w:rFonts w:ascii="Arial" w:cs="Arial" w:eastAsia="Arial" w:hAnsi="Arial"/>
+              </w:rPr>
+              <w:t xml:space="preserve">Hourly</w:t>
+            </w:r>
+          </w:p>
+        </w:tc>
+        <w:tc>
+          <w:tcPr>
+            <w:tcW w:type="dxa" w:w="7160"/>
+            <w:tcBorders>
+              <w:top w:val="single" w:color="D9D9E0" w:sz="1"/>
+              <w:left w:val="single" w:color="D9D9E0" w:sz="1"/>
+              <w:bottom w:val="single" w:color="D9D9E0" w:sz="1"/>
+              <w:right w:val="single" w:color="D9D9E0" w:sz="1"/>
+            </w:tcBorders>
+            <w:tcMar>
+              <w:top w:type="dxa" w:w="60"/>
+              <w:left w:type="dxa" w:w="120"/>
+              <w:bottom w:type="dxa" w:w="60"/>
+              <w:right w:type="dxa" w:w="120"/>
+            </w:tcMar>
+          </w:tcPr>
+          <w:p>
+            <w:pPr>
+              <w:spacing w:after="0" w:line="252"/>
+            </w:pPr>
+            <w:r>
+              <w:rPr>
+                <w:b w:val="false"/>
+                <w:bCs w:val="false"/>
+                <w:color w:val="1A1A22"/>
+                <w:sz w:val="18"/>
+                <w:szCs w:val="18"/>
+                <w:rFonts w:ascii="Arial" w:cs="Arial" w:eastAsia="Arial" w:hAnsi="Arial"/>
+              </w:rPr>
+              <w:t xml:space="preserve">Judge + outcome scoring label the trajectories.</w:t>
+            </w:r>
+          </w:p>
+        </w:tc>
+      </w:tr>
+      <w:tr>
+        <w:tc>
+          <w:tcPr>
+            <w:tcW w:type="dxa" w:w="2200"/>
+            <w:tcBorders>
+              <w:top w:val="single" w:color="D9D9E0" w:sz="1"/>
+              <w:left w:val="single" w:color="D9D9E0" w:sz="1"/>
+              <w:bottom w:val="single" w:color="D9D9E0" w:sz="1"/>
+              <w:right w:val="single" w:color="D9D9E0" w:sz="1"/>
+            </w:tcBorders>
+            <w:tcMar>
+              <w:top w:type="dxa" w:w="60"/>
+              <w:left w:type="dxa" w:w="120"/>
+              <w:bottom w:type="dxa" w:w="60"/>
+              <w:right w:type="dxa" w:w="120"/>
+            </w:tcMar>
+          </w:tcPr>
+          <w:p>
+            <w:pPr>
+              <w:spacing w:after="0" w:line="252"/>
+            </w:pPr>
+            <w:r>
+              <w:rPr>
+                <w:b w:val="false"/>
+                <w:bCs w:val="false"/>
+                <w:color w:val="1A1A22"/>
+                <w:sz w:val="18"/>
+                <w:szCs w:val="18"/>
+                <w:rFonts w:ascii="Arial" w:cs="Arial" w:eastAsia="Arial" w:hAnsi="Arial"/>
+              </w:rPr>
+              <w:t xml:space="preserve">Nightly (batch)</w:t>
+            </w:r>
+          </w:p>
+        </w:tc>
+        <w:tc>
+          <w:tcPr>
+            <w:tcW w:type="dxa" w:w="7160"/>
+            <w:tcBorders>
+              <w:top w:val="single" w:color="D9D9E0" w:sz="1"/>
+              <w:left w:val="single" w:color="D9D9E0" w:sz="1"/>
+              <w:bottom w:val="single" w:color="D9D9E0" w:sz="1"/>
+              <w:right w:val="single" w:color="D9D9E0" w:sz="1"/>
+            </w:tcBorders>
+            <w:tcMar>
+              <w:top w:type="dxa" w:w="60"/>
+              <w:left w:type="dxa" w:w="120"/>
+              <w:bottom w:type="dxa" w:w="60"/>
+              <w:right w:type="dxa" w:w="120"/>
+            </w:tcMar>
+          </w:tcPr>
+          <w:p>
+            <w:pPr>
+              <w:spacing w:after="0" w:line="252"/>
+            </w:pPr>
+            <w:r>
+              <w:rPr>
+                <w:b w:val="false"/>
+                <w:bCs w:val="false"/>
+                <w:color w:val="1A1A22"/>
+                <w:sz w:val="18"/>
+                <w:szCs w:val="18"/>
+                <w:rFonts w:ascii="Arial" w:cs="Arial" w:eastAsia="Arial" w:hAnsi="Arial"/>
+              </w:rPr>
+              <w:t xml:space="preserve">Distill lessons → build child G(n+1) → run the gate on a held-out set.</w:t>
+            </w:r>
+          </w:p>
+        </w:tc>
+      </w:tr>
+      <w:tr>
+        <w:tc>
+          <w:tcPr>
+            <w:tcW w:type="dxa" w:w="2200"/>
+            <w:tcBorders>
+              <w:top w:val="single" w:color="D9D9E0" w:sz="1"/>
+              <w:left w:val="single" w:color="D9D9E0" w:sz="1"/>
+              <w:bottom w:val="single" w:color="D9D9E0" w:sz="1"/>
+              <w:right w:val="single" w:color="D9D9E0" w:sz="1"/>
+            </w:tcBorders>
+            <w:tcMar>
+              <w:top w:type="dxa" w:w="60"/>
+              <w:left w:type="dxa" w:w="120"/>
+              <w:bottom w:type="dxa" w:w="60"/>
+              <w:right w:type="dxa" w:w="120"/>
+            </w:tcMar>
+          </w:tcPr>
+          <w:p>
+            <w:pPr>
+              <w:spacing w:after="0" w:line="252"/>
+            </w:pPr>
+            <w:r>
+              <w:rPr>
+                <w:b w:val="false"/>
+                <w:bCs w:val="false"/>
+                <w:color w:val="1A1A22"/>
+                <w:sz w:val="18"/>
+                <w:szCs w:val="18"/>
+                <w:rFonts w:ascii="Arial" w:cs="Arial" w:eastAsia="Arial" w:hAnsi="Arial"/>
+              </w:rPr>
+              <w:t xml:space="preserve">Weekly (human)</w:t>
+            </w:r>
+          </w:p>
+        </w:tc>
+        <w:tc>
+          <w:tcPr>
+            <w:tcW w:type="dxa" w:w="7160"/>
+            <w:tcBorders>
+              <w:top w:val="single" w:color="D9D9E0" w:sz="1"/>
+              <w:left w:val="single" w:color="D9D9E0" w:sz="1"/>
+              <w:bottom w:val="single" w:color="D9D9E0" w:sz="1"/>
+              <w:right w:val="single" w:color="D9D9E0" w:sz="1"/>
+            </w:tcBorders>
+            <w:tcMar>
+              <w:top w:type="dxa" w:w="60"/>
+              <w:left w:type="dxa" w:w="120"/>
+              <w:bottom w:type="dxa" w:w="60"/>
+              <w:right w:type="dxa" w:w="120"/>
+            </w:tcMar>
+          </w:tcPr>
+          <w:p>
+            <w:pPr>
+              <w:spacing w:after="0" w:line="252"/>
+            </w:pPr>
+            <w:r>
+              <w:rPr>
+                <w:b w:val="false"/>
+                <w:bCs w:val="false"/>
+                <w:color w:val="1A1A22"/>
+                <w:sz w:val="18"/>
+                <w:szCs w:val="18"/>
+                <w:rFonts w:ascii="Arial" w:cs="Arial" w:eastAsia="Arial" w:hAnsi="Arial"/>
+              </w:rPr>
+              <w:t xml:space="preserve">Reviewer sees the diff + metrics in the dashboard → clicks Promote.</w:t>
+            </w:r>
+          </w:p>
+        </w:tc>
+      </w:tr>
+      <w:tr>
+        <w:tc>
+          <w:tcPr>
+            <w:tcW w:type="dxa" w:w="2200"/>
+            <w:tcBorders>
+              <w:top w:val="single" w:color="D9D9E0" w:sz="1"/>
+              <w:left w:val="single" w:color="D9D9E0" w:sz="1"/>
+              <w:bottom w:val="single" w:color="D9D9E0" w:sz="1"/>
+              <w:right w:val="single" w:color="D9D9E0" w:sz="1"/>
+            </w:tcBorders>
+            <w:tcMar>
+              <w:top w:type="dxa" w:w="60"/>
+              <w:left w:type="dxa" w:w="120"/>
+              <w:bottom w:type="dxa" w:w="60"/>
+              <w:right w:type="dxa" w:w="120"/>
+            </w:tcMar>
+          </w:tcPr>
+          <w:p>
+            <w:pPr>
+              <w:spacing w:after="0" w:line="252"/>
+            </w:pPr>
+            <w:r>
+              <w:rPr>
+                <w:b w:val="false"/>
+                <w:bCs w:val="false"/>
+                <w:color w:val="1A1A22"/>
+                <w:sz w:val="18"/>
+                <w:szCs w:val="18"/>
+                <w:rFonts w:ascii="Arial" w:cs="Arial" w:eastAsia="Arial" w:hAnsi="Arial"/>
+              </w:rPr>
+              <w:t xml:space="preserve">On regression</w:t>
+            </w:r>
+          </w:p>
+        </w:tc>
+        <w:tc>
+          <w:tcPr>
+            <w:tcW w:type="dxa" w:w="7160"/>
+            <w:tcBorders>
+              <w:top w:val="single" w:color="D9D9E0" w:sz="1"/>
+              <w:left w:val="single" w:color="D9D9E0" w:sz="1"/>
+              <w:bottom w:val="single" w:color="D9D9E0" w:sz="1"/>
+              <w:right w:val="single" w:color="D9D9E0" w:sz="1"/>
+            </w:tcBorders>
+            <w:tcMar>
+              <w:top w:type="dxa" w:w="60"/>
+              <w:left w:type="dxa" w:w="120"/>
+              <w:bottom w:type="dxa" w:w="60"/>
+              <w:right w:type="dxa" w:w="120"/>
+            </w:tcMar>
+          </w:tcPr>
+          <w:p>
+            <w:pPr>
+              <w:spacing w:after="0" w:line="252"/>
+            </w:pPr>
+            <w:r>
+              <w:rPr>
+                <w:b w:val="false"/>
+                <w:bCs w:val="false"/>
+                <w:color w:val="1A1A22"/>
+                <w:sz w:val="18"/>
+                <w:szCs w:val="18"/>
+                <w:rFonts w:ascii="Arial" w:cs="Arial" w:eastAsia="Arial" w:hAnsi="Arial"/>
+              </w:rPr>
+              <w:t xml:space="preserve">One-click rollback, or auto-rollback if a live metric degrades after promotion.</w:t>
+            </w:r>
+          </w:p>
+        </w:tc>
+      </w:tr>
+    </w:tbl>
+    <w:p>
+      <w:r>
+        <w:br w:type="page"/>
       </w:r>
     </w:p>
     <w:p>
       <w:pPr>
-        <w:pStyle w:val="Heading2"/>
-      </w:pPr>
-      <w:r>
-        <w:rPr>
-          <w:rFonts w:ascii="Arial" w:cs="Arial" w:eastAsia="Arial" w:hAnsi="Arial"/>
-        </w:rPr>
-        <w:t xml:space="preserve">Connecting an external agent</w:t>
+        <w:pStyle w:val="Heading1"/>
+      </w:pPr>
+      <w:r>
+        <w:rPr>
+          <w:rFonts w:ascii="Arial" w:cs="Arial" w:eastAsia="Arial" w:hAnsi="Arial"/>
+        </w:rPr>
+        <w:t xml:space="preserve">4.  Production integration</w:t>
       </w:r>
     </w:p>
     <w:p>
@@ -1417,177 +1392,60 @@
           <w:szCs w:val="21"/>
           <w:rFonts w:ascii="Arial" w:cs="Arial" w:eastAsia="Arial" w:hAnsi="Arial"/>
         </w:rPr>
-        <w:t xml:space="preserve">aprntc owns neither the agent’s code nor its prompt, so the Playbook becomes a contract with two halves:</w:t>
+        <w:t xml:space="preserve">aprntc sits </w:t>
+      </w:r>
+      <w:r>
+        <w:rPr>
+          <w:b/>
+          <w:bCs/>
+          <w:color w:val="1A1A22"/>
+          <w:sz w:val="21"/>
+          <w:szCs w:val="21"/>
+          <w:rFonts w:ascii="Arial" w:cs="Arial" w:eastAsia="Arial" w:hAnsi="Arial"/>
+        </w:rPr>
+        <w:t xml:space="preserve">beside</w:t>
+      </w:r>
+      <w:r>
+        <w:rPr>
+          <w:color w:val="1A1A22"/>
+          <w:sz w:val="21"/>
+          <w:szCs w:val="21"/>
+          <w:rFonts w:ascii="Arial" w:cs="Arial" w:eastAsia="Arial" w:hAnsi="Arial"/>
+        </w:rPr>
+        <w:t xml:space="preserve"> your agent, never in front of it. The production agent keeps running exactly as today; aprntc is a separate service that observes, improves, and proposes. It is </w:t>
+      </w:r>
+      <w:r>
+        <w:rPr>
+          <w:b/>
+          <w:bCs/>
+          <w:color w:val="1A1A22"/>
+          <w:sz w:val="21"/>
+          <w:szCs w:val="21"/>
+          <w:rFonts w:ascii="Arial" w:cs="Arial" w:eastAsia="Arial" w:hAnsi="Arial"/>
+        </w:rPr>
+        <w:t xml:space="preserve">never in the user request path</w:t>
+      </w:r>
+      <w:r>
+        <w:rPr>
+          <w:color w:val="1A1A22"/>
+          <w:sz w:val="21"/>
+          <w:szCs w:val="21"/>
+          <w:rFonts w:ascii="Arial" w:cs="Arial" w:eastAsia="Arial" w:hAnsi="Arial"/>
+        </w:rPr>
+        <w:t xml:space="preserve"> — if it’s down or wrong, production is unaffected.</w:t>
       </w:r>
     </w:p>
     <w:p>
       <w:pPr>
-        <w:pStyle w:val="ListParagraph"/>
-        <w:numPr>
-          <w:ilvl w:val="0"/>
-          <w:numId w:val="2"/>
-        </w:numPr>
-        <w:spacing w:after="60" w:line="264"/>
-      </w:pPr>
-      <w:r>
-        <w:rPr>
-          <w:b/>
-          <w:bCs/>
-          <w:color w:val="1A1A22"/>
-          <w:sz w:val="21"/>
-          <w:szCs w:val="21"/>
-          <w:rFonts w:ascii="Arial" w:cs="Arial" w:eastAsia="Arial" w:hAnsi="Arial"/>
-        </w:rPr>
-        <w:t xml:space="preserve">Inbound (observe).  </w:t>
-      </w:r>
-      <w:r>
-        <w:rPr>
-          <w:color w:val="1A1A22"/>
-          <w:sz w:val="21"/>
-          <w:szCs w:val="21"/>
-          <w:rFonts w:ascii="Arial" w:cs="Arial" w:eastAsia="Arial" w:hAnsi="Arial"/>
-        </w:rPr>
-        <w:t xml:space="preserve">The agent’s traffic flows into aprntc via a tap (egress proxy / OpenTelemetry / MCP gateway). Read-only. This is how aprntc sees behavior without owning the code.</w:t>
-      </w:r>
-    </w:p>
-    <w:p>
-      <w:pPr>
-        <w:pStyle w:val="ListParagraph"/>
-        <w:numPr>
-          <w:ilvl w:val="0"/>
-          <w:numId w:val="2"/>
-        </w:numPr>
-        <w:spacing w:after="60" w:line="264"/>
-      </w:pPr>
-      <w:r>
-        <w:rPr>
-          <w:b/>
-          <w:bCs/>
-          <w:color w:val="1A1A22"/>
-          <w:sz w:val="21"/>
-          <w:szCs w:val="21"/>
-          <w:rFonts w:ascii="Arial" w:cs="Arial" w:eastAsia="Arial" w:hAnsi="Arial"/>
-        </w:rPr>
-        <w:t xml:space="preserve">Outbound (control).  </w:t>
-      </w:r>
-      <w:r>
-        <w:rPr>
-          <w:color w:val="1A1A22"/>
-          <w:sz w:val="21"/>
-          <w:szCs w:val="21"/>
-          <w:rFonts w:ascii="Arial" w:cs="Arial" w:eastAsia="Arial" w:hAnsi="Arial"/>
-        </w:rPr>
-        <w:t xml:space="preserve">The agent pulls its active playbook from aprntc’s config-fetch API (</w:t>
-      </w:r>
-      <w:r>
-        <w:rPr>
-          <w:color w:val="33336A"/>
-          <w:sz w:val="19"/>
-          <w:szCs w:val="19"/>
-          <w:rFonts w:ascii="Consolas" w:cs="Consolas" w:eastAsia="Consolas" w:hAnsi="Consolas"/>
-        </w:rPr>
-        <w:t xml:space="preserve">GET /api/playbooks/{id}/active</w:t>
-      </w:r>
-      <w:r>
-        <w:rPr>
-          <w:color w:val="1A1A22"/>
-          <w:sz w:val="21"/>
-          <w:szCs w:val="21"/>
-          <w:rFonts w:ascii="Arial" w:cs="Arial" w:eastAsia="Arial" w:hAnsi="Arial"/>
-        </w:rPr>
-        <w:t xml:space="preserve">). Promotion updates what’s served; the agent picks it up. Rollback serves the prior version. No redeploy.</w:t>
-      </w:r>
-    </w:p>
-    <w:p>
-      <w:pPr>
-        <w:spacing w:after="120" w:line="276"/>
-      </w:pPr>
-      <w:r>
-        <w:rPr>
-          <w:color w:val="8A8A95"/>
-          <w:sz w:val="19"/>
-          <w:szCs w:val="19"/>
-          <w:rFonts w:ascii="Arial" w:cs="Arial" w:eastAsia="Arial" w:hAnsi="Arial"/>
-        </w:rPr>
-        <w:t xml:space="preserve">Initial G0 = the customer registers their current system prompt (aprntc needs only the prompt text, not the code); if they don’t, aprntc infers an approximate G0 from the system prompt the tap observed.</w:t>
-      </w:r>
-    </w:p>
-    <w:p>
-      <w:pPr>
-        <w:pStyle w:val="Heading2"/>
-      </w:pPr>
-      <w:r>
-        <w:rPr>
-          <w:rFonts w:ascii="Arial" w:cs="Arial" w:eastAsia="Arial" w:hAnsi="Arial"/>
-        </w:rPr>
-        <w:t xml:space="preserve">Tap boundaries — which collector, which scenario</w:t>
-      </w:r>
-    </w:p>
-    <w:p>
-      <w:pPr>
-        <w:spacing w:after="120" w:line="276"/>
-      </w:pPr>
-      <w:r>
-        <w:rPr>
-          <w:color w:val="1A1A22"/>
-          <w:sz w:val="21"/>
-          <w:szCs w:val="21"/>
-          <w:rFonts w:ascii="Arial" w:cs="Arial" w:eastAsia="Arial" w:hAnsi="Arial"/>
-        </w:rPr>
-        <w:t xml:space="preserve">The inbound tap isn’t one integration; it’s a set of </w:t>
-      </w:r>
-      <w:r>
-        <w:rPr>
-          <w:b/>
-          <w:bCs/>
-          <w:color w:val="1A1A22"/>
-          <w:sz w:val="21"/>
-          <w:szCs w:val="21"/>
-          <w:rFonts w:ascii="Arial" w:cs="Arial" w:eastAsia="Arial" w:hAnsi="Arial"/>
-        </w:rPr>
-        <w:t xml:space="preserve">collectors at stable protocol boundaries</w:t>
-      </w:r>
-      <w:r>
-        <w:rPr>
-          <w:color w:val="1A1A22"/>
-          <w:sz w:val="21"/>
-          <w:szCs w:val="21"/>
-          <w:rFonts w:ascii="Arial" w:cs="Arial" w:eastAsia="Arial" w:hAnsi="Arial"/>
-        </w:rPr>
-        <w:t xml:space="preserve">. You attach at whichever boundary your agent already exposes — no framework lock-in. Each collector normalizes into the </w:t>
-      </w:r>
-      <w:r>
-        <w:rPr>
-          <w:i/>
-          <w:iCs/>
-          <w:color w:val="1A1A22"/>
-          <w:sz w:val="21"/>
-          <w:szCs w:val="21"/>
-          <w:rFonts w:ascii="Arial" w:cs="Arial" w:eastAsia="Arial" w:hAnsi="Arial"/>
-        </w:rPr>
-        <w:t xml:space="preserve">same</w:t>
-      </w:r>
-      <w:r>
-        <w:rPr>
-          <w:color w:val="1A1A22"/>
-          <w:sz w:val="21"/>
-          <w:szCs w:val="21"/>
-          <w:rFonts w:ascii="Arial" w:cs="Arial" w:eastAsia="Arial" w:hAnsi="Arial"/>
-        </w:rPr>
-        <w:t xml:space="preserve"> canonical Trajectory, and fidelity degrades gracefully by how the target was built: an agent we own gives full tool tracking; a closed-source agent behind the proxy still gives us model traffic.</w:t>
-      </w:r>
-    </w:p>
-    <w:p>
-      <w:pPr>
         <w:spacing w:before="120" w:after="60"/>
         <w:jc w:val="center"/>
       </w:pPr>
       <w:r>
         <w:drawing>
           <wp:inline distT="0" distB="0" distL="0" distR="0">
-            <wp:extent cx="6172200" cy="3686175"/>
+            <wp:extent cx="5943600" cy="3629025"/>
             <wp:effectExtent t="0" r="0" b="0" l="0"/>
-            <wp:docPr id="1" name="fig4-taps.png" descr="Figure 4 — The four tap boundaries, the collector at each, the scenario it fits, and how complete its tool-call capture is. A2A is the deferred fifth boundary." title="Figure 4 — The four tap boundaries, the collector at each, the scenario it fits, and how complete its tool-call capture is. A2A is the deferred fifth boundary."/>
+            <wp:docPr id="1" name="fig3-production.png" descr="Figure 3 — aprntc observes via a read-only tap (inbound) and serves the improved playbook the agent pulls (outbound). The gated config swap is the only write back to production." title="Figure 3 — aprntc observes via a read-only tap (inbound) and"/>
             <wp:cNvGraphicFramePr>
               <a:graphicFrameLocks xmlns:a="http://schemas.openxmlformats.org/drawingml/2006/main" noChangeAspect="1"/>
             </wp:cNvGraphicFramePr>
@@ -1602,6 +1460,251 @@
                   </pic:nvPicPr>
                   <pic:blipFill>
                     <a:blip r:embed="rId9" cstate="none"/>
+                    <a:srcRect/>
+                    <a:stretch>
+                      <a:fillRect/>
+                    </a:stretch>
+                  </pic:blipFill>
+                  <pic:spPr bwMode="auto">
+                    <a:xfrm>
+                      <a:off x="0" y="0"/>
+                      <a:ext cx="5943600" cy="3629025"/>
+                    </a:xfrm>
+                    <a:prstGeom prst="rect">
+                      <a:avLst/>
+                    </a:prstGeom>
+                  </pic:spPr>
+                </pic:pic>
+              </a:graphicData>
+            </a:graphic>
+          </wp:inline>
+        </w:drawing>
+      </w:r>
+    </w:p>
+    <w:p>
+      <w:pPr>
+        <w:spacing w:after="200"/>
+        <w:jc w:val="center"/>
+      </w:pPr>
+      <w:r>
+        <w:rPr>
+          <w:i/>
+          <w:iCs/>
+          <w:color w:val="8A8A95"/>
+          <w:sz w:val="17"/>
+          <w:szCs w:val="17"/>
+          <w:rFonts w:ascii="Arial" w:cs="Arial" w:eastAsia="Arial" w:hAnsi="Arial"/>
+        </w:rPr>
+        <w:t xml:space="preserve">Figure 3 — aprntc observes via a read-only tap (inbound) and serves the improved playbook the agent pulls (outbound). The gated config swap is the only write back to production.</w:t>
+      </w:r>
+    </w:p>
+    <w:p>
+      <w:pPr>
+        <w:pStyle w:val="Heading2"/>
+      </w:pPr>
+      <w:r>
+        <w:rPr>
+          <w:rFonts w:ascii="Arial" w:cs="Arial" w:eastAsia="Arial" w:hAnsi="Arial"/>
+        </w:rPr>
+        <w:t xml:space="preserve">Connecting an external agent</w:t>
+      </w:r>
+    </w:p>
+    <w:p>
+      <w:pPr>
+        <w:spacing w:after="120" w:line="276"/>
+      </w:pPr>
+      <w:r>
+        <w:rPr>
+          <w:color w:val="1A1A22"/>
+          <w:sz w:val="21"/>
+          <w:szCs w:val="21"/>
+          <w:rFonts w:ascii="Arial" w:cs="Arial" w:eastAsia="Arial" w:hAnsi="Arial"/>
+        </w:rPr>
+        <w:t xml:space="preserve">aprntc owns neither the agent’s code nor its prompt, so the Playbook becomes a contract with two halves:</w:t>
+      </w:r>
+    </w:p>
+    <w:p>
+      <w:pPr>
+        <w:pStyle w:val="ListParagraph"/>
+        <w:numPr>
+          <w:ilvl w:val="0"/>
+          <w:numId w:val="2"/>
+        </w:numPr>
+        <w:spacing w:after="60" w:line="264"/>
+      </w:pPr>
+      <w:r>
+        <w:rPr>
+          <w:b/>
+          <w:bCs/>
+          <w:color w:val="1A1A22"/>
+          <w:sz w:val="21"/>
+          <w:szCs w:val="21"/>
+          <w:rFonts w:ascii="Arial" w:cs="Arial" w:eastAsia="Arial" w:hAnsi="Arial"/>
+        </w:rPr>
+        <w:t xml:space="preserve">Inbound (observe).  </w:t>
+      </w:r>
+      <w:r>
+        <w:rPr>
+          <w:color w:val="1A1A22"/>
+          <w:sz w:val="21"/>
+          <w:szCs w:val="21"/>
+          <w:rFonts w:ascii="Arial" w:cs="Arial" w:eastAsia="Arial" w:hAnsi="Arial"/>
+        </w:rPr>
+        <w:t xml:space="preserve">The agent’s traffic flows into aprntc via a tap (egress proxy / OpenTelemetry / MCP gateway). Read-only. This is how aprntc sees behavior without owning the code.</w:t>
+      </w:r>
+    </w:p>
+    <w:p>
+      <w:pPr>
+        <w:pStyle w:val="ListParagraph"/>
+        <w:numPr>
+          <w:ilvl w:val="0"/>
+          <w:numId w:val="2"/>
+        </w:numPr>
+        <w:spacing w:after="60" w:line="264"/>
+      </w:pPr>
+      <w:r>
+        <w:rPr>
+          <w:b/>
+          <w:bCs/>
+          <w:color w:val="1A1A22"/>
+          <w:sz w:val="21"/>
+          <w:szCs w:val="21"/>
+          <w:rFonts w:ascii="Arial" w:cs="Arial" w:eastAsia="Arial" w:hAnsi="Arial"/>
+        </w:rPr>
+        <w:t xml:space="preserve">Outbound (control).  </w:t>
+      </w:r>
+      <w:r>
+        <w:rPr>
+          <w:color w:val="1A1A22"/>
+          <w:sz w:val="21"/>
+          <w:szCs w:val="21"/>
+          <w:rFonts w:ascii="Arial" w:cs="Arial" w:eastAsia="Arial" w:hAnsi="Arial"/>
+        </w:rPr>
+        <w:t xml:space="preserve">The agent pulls its active playbook from aprntc’s config-fetch API (</w:t>
+      </w:r>
+      <w:r>
+        <w:rPr>
+          <w:color w:val="33336A"/>
+          <w:sz w:val="19"/>
+          <w:szCs w:val="19"/>
+          <w:rFonts w:ascii="Consolas" w:cs="Consolas" w:eastAsia="Consolas" w:hAnsi="Consolas"/>
+        </w:rPr>
+        <w:t xml:space="preserve">GET /api/playbooks/{id}/active</w:t>
+      </w:r>
+      <w:r>
+        <w:rPr>
+          <w:color w:val="1A1A22"/>
+          <w:sz w:val="21"/>
+          <w:szCs w:val="21"/>
+          <w:rFonts w:ascii="Arial" w:cs="Arial" w:eastAsia="Arial" w:hAnsi="Arial"/>
+        </w:rPr>
+        <w:t xml:space="preserve">). Promotion updates what’s served; the agent picks it up. Rollback serves the prior version. No redeploy.</w:t>
+      </w:r>
+    </w:p>
+    <w:p>
+      <w:pPr>
+        <w:spacing w:after="120" w:line="276"/>
+      </w:pPr>
+      <w:r>
+        <w:rPr>
+          <w:color w:val="8A8A95"/>
+          <w:sz w:val="19"/>
+          <w:szCs w:val="19"/>
+          <w:rFonts w:ascii="Arial" w:cs="Arial" w:eastAsia="Arial" w:hAnsi="Arial"/>
+        </w:rPr>
+        <w:t xml:space="preserve">Initial G0 = the customer registers their current system prompt (aprntc needs only the prompt text, not the code); if they don’t, aprntc infers an approximate G0 from the system prompt the tap observed.</w:t>
+      </w:r>
+    </w:p>
+    <w:p>
+      <w:pPr>
+        <w:pStyle w:val="Heading2"/>
+      </w:pPr>
+      <w:r>
+        <w:rPr>
+          <w:rFonts w:ascii="Arial" w:cs="Arial" w:eastAsia="Arial" w:hAnsi="Arial"/>
+        </w:rPr>
+        <w:t xml:space="preserve">Tap boundaries — which collector, which scenario</w:t>
+      </w:r>
+    </w:p>
+    <w:p>
+      <w:pPr>
+        <w:spacing w:after="120" w:line="276"/>
+      </w:pPr>
+      <w:r>
+        <w:rPr>
+          <w:color w:val="1A1A22"/>
+          <w:sz w:val="21"/>
+          <w:szCs w:val="21"/>
+          <w:rFonts w:ascii="Arial" w:cs="Arial" w:eastAsia="Arial" w:hAnsi="Arial"/>
+        </w:rPr>
+        <w:t xml:space="preserve">The inbound tap isn’t one integration; it’s a set of </w:t>
+      </w:r>
+      <w:r>
+        <w:rPr>
+          <w:b/>
+          <w:bCs/>
+          <w:color w:val="1A1A22"/>
+          <w:sz w:val="21"/>
+          <w:szCs w:val="21"/>
+          <w:rFonts w:ascii="Arial" w:cs="Arial" w:eastAsia="Arial" w:hAnsi="Arial"/>
+        </w:rPr>
+        <w:t xml:space="preserve">collectors at stable protocol boundaries</w:t>
+      </w:r>
+      <w:r>
+        <w:rPr>
+          <w:color w:val="1A1A22"/>
+          <w:sz w:val="21"/>
+          <w:szCs w:val="21"/>
+          <w:rFonts w:ascii="Arial" w:cs="Arial" w:eastAsia="Arial" w:hAnsi="Arial"/>
+        </w:rPr>
+        <w:t xml:space="preserve">. You attach at whichever boundary your agent already exposes — no framework lock-in. Each collector normalizes into the </w:t>
+      </w:r>
+      <w:r>
+        <w:rPr>
+          <w:i/>
+          <w:iCs/>
+          <w:color w:val="1A1A22"/>
+          <w:sz w:val="21"/>
+          <w:szCs w:val="21"/>
+          <w:rFonts w:ascii="Arial" w:cs="Arial" w:eastAsia="Arial" w:hAnsi="Arial"/>
+        </w:rPr>
+        <w:t xml:space="preserve">same</w:t>
+      </w:r>
+      <w:r>
+        <w:rPr>
+          <w:color w:val="1A1A22"/>
+          <w:sz w:val="21"/>
+          <w:szCs w:val="21"/>
+          <w:rFonts w:ascii="Arial" w:cs="Arial" w:eastAsia="Arial" w:hAnsi="Arial"/>
+        </w:rPr>
+        <w:t xml:space="preserve"> canonical Trajectory, and fidelity degrades gracefully by how the target was built: an agent we own gives full tool tracking; a closed-source agent behind the proxy still gives us model traffic.</w:t>
+      </w:r>
+    </w:p>
+    <w:p>
+      <w:pPr>
+        <w:spacing w:before="120" w:after="60"/>
+        <w:jc w:val="center"/>
+      </w:pPr>
+      <w:r>
+        <w:drawing>
+          <wp:inline distT="0" distB="0" distL="0" distR="0">
+            <wp:extent cx="6172200" cy="3686175"/>
+            <wp:effectExtent t="0" r="0" b="0" l="0"/>
+            <wp:docPr id="1" name="fig4-taps.png" descr="Figure 4 — The four tap boundaries, the collector at each, the scenario it fits, and how complete its tool-call capture is. A2A is the deferred fifth boundary." title="Figure 4 — The four tap boundaries, the collector at each, t"/>
+            <wp:cNvGraphicFramePr>
+              <a:graphicFrameLocks xmlns:a="http://schemas.openxmlformats.org/drawingml/2006/main" noChangeAspect="1"/>
+            </wp:cNvGraphicFramePr>
+            <a:graphic xmlns:a="http://schemas.openxmlformats.org/drawingml/2006/main">
+              <a:graphicData uri="http://schemas.openxmlformats.org/drawingml/2006/picture">
+                <pic:pic xmlns:pic="http://schemas.openxmlformats.org/drawingml/2006/picture">
+                  <pic:nvPicPr>
+                    <pic:cNvPr id="0" name="" descr=""/>
+                    <pic:cNvPicPr>
+                      <a:picLocks noChangeAspect="1" noChangeArrowheads="1"/>
+                    </pic:cNvPicPr>
+                  </pic:nvPicPr>
+                  <pic:blipFill>
+                    <a:blip r:embed="rId10" cstate="none"/>
                     <a:srcRect/>
                     <a:stretch>
                       <a:fillRect/>

</xml_diff>

<commit_message>
docs: keep production diagram only in §1; renumber tap figure
The production-architecture diagram now appears once — as the at-a-glance
overview in §1 (The concept). Removed the duplicate from §4 (Production
integration), which now opens with a back-reference to the §1 overview
and goes straight into how an external agent connects. Tap-boundaries
figure renumbered Figure 4 → Figure 3. Applied to both the HTML and Word
docs (Word back to 4 embedded images).

Co-Authored-By: Claude Opus 4.8 <noreply@anthropic.com>
</commit_message>
<xml_diff>
--- a/docs/design/aprntc-design.docx
+++ b/docs/design/aprntc-design.docx
@@ -1432,7 +1432,189 @@
           <w:szCs w:val="21"/>
           <w:rFonts w:ascii="Arial" w:cs="Arial" w:eastAsia="Arial" w:hAnsi="Arial"/>
         </w:rPr>
-        <w:t xml:space="preserve"> — if it’s down or wrong, production is unaffected.</w:t>
+        <w:t xml:space="preserve"> — if it’s down or wrong, production is unaffected. The overall topology is the at-a-glance diagram in §1; this section details how an external agent connects.</w:t>
+      </w:r>
+    </w:p>
+    <w:p>
+      <w:pPr>
+        <w:pStyle w:val="Heading2"/>
+      </w:pPr>
+      <w:r>
+        <w:rPr>
+          <w:rFonts w:ascii="Arial" w:cs="Arial" w:eastAsia="Arial" w:hAnsi="Arial"/>
+        </w:rPr>
+        <w:t xml:space="preserve">Connecting an external agent</w:t>
+      </w:r>
+    </w:p>
+    <w:p>
+      <w:pPr>
+        <w:spacing w:after="120" w:line="276"/>
+      </w:pPr>
+      <w:r>
+        <w:rPr>
+          <w:color w:val="1A1A22"/>
+          <w:sz w:val="21"/>
+          <w:szCs w:val="21"/>
+          <w:rFonts w:ascii="Arial" w:cs="Arial" w:eastAsia="Arial" w:hAnsi="Arial"/>
+        </w:rPr>
+        <w:t xml:space="preserve">aprntc owns neither the agent’s code nor its prompt, so the Playbook becomes a contract with two halves:</w:t>
+      </w:r>
+    </w:p>
+    <w:p>
+      <w:pPr>
+        <w:pStyle w:val="ListParagraph"/>
+        <w:numPr>
+          <w:ilvl w:val="0"/>
+          <w:numId w:val="2"/>
+        </w:numPr>
+        <w:spacing w:after="60" w:line="264"/>
+      </w:pPr>
+      <w:r>
+        <w:rPr>
+          <w:b/>
+          <w:bCs/>
+          <w:color w:val="1A1A22"/>
+          <w:sz w:val="21"/>
+          <w:szCs w:val="21"/>
+          <w:rFonts w:ascii="Arial" w:cs="Arial" w:eastAsia="Arial" w:hAnsi="Arial"/>
+        </w:rPr>
+        <w:t xml:space="preserve">Inbound (observe).  </w:t>
+      </w:r>
+      <w:r>
+        <w:rPr>
+          <w:color w:val="1A1A22"/>
+          <w:sz w:val="21"/>
+          <w:szCs w:val="21"/>
+          <w:rFonts w:ascii="Arial" w:cs="Arial" w:eastAsia="Arial" w:hAnsi="Arial"/>
+        </w:rPr>
+        <w:t xml:space="preserve">The agent’s traffic flows into aprntc via a tap (egress proxy / OpenTelemetry / MCP gateway). Read-only. This is how aprntc sees behavior without owning the code.</w:t>
+      </w:r>
+    </w:p>
+    <w:p>
+      <w:pPr>
+        <w:pStyle w:val="ListParagraph"/>
+        <w:numPr>
+          <w:ilvl w:val="0"/>
+          <w:numId w:val="2"/>
+        </w:numPr>
+        <w:spacing w:after="60" w:line="264"/>
+      </w:pPr>
+      <w:r>
+        <w:rPr>
+          <w:b/>
+          <w:bCs/>
+          <w:color w:val="1A1A22"/>
+          <w:sz w:val="21"/>
+          <w:szCs w:val="21"/>
+          <w:rFonts w:ascii="Arial" w:cs="Arial" w:eastAsia="Arial" w:hAnsi="Arial"/>
+        </w:rPr>
+        <w:t xml:space="preserve">Outbound (control).  </w:t>
+      </w:r>
+      <w:r>
+        <w:rPr>
+          <w:color w:val="1A1A22"/>
+          <w:sz w:val="21"/>
+          <w:szCs w:val="21"/>
+          <w:rFonts w:ascii="Arial" w:cs="Arial" w:eastAsia="Arial" w:hAnsi="Arial"/>
+        </w:rPr>
+        <w:t xml:space="preserve">The agent pulls its active playbook from aprntc’s config-fetch API (</w:t>
+      </w:r>
+      <w:r>
+        <w:rPr>
+          <w:color w:val="33336A"/>
+          <w:sz w:val="19"/>
+          <w:szCs w:val="19"/>
+          <w:rFonts w:ascii="Consolas" w:cs="Consolas" w:eastAsia="Consolas" w:hAnsi="Consolas"/>
+        </w:rPr>
+        <w:t xml:space="preserve">GET /api/playbooks/{id}/active</w:t>
+      </w:r>
+      <w:r>
+        <w:rPr>
+          <w:color w:val="1A1A22"/>
+          <w:sz w:val="21"/>
+          <w:szCs w:val="21"/>
+          <w:rFonts w:ascii="Arial" w:cs="Arial" w:eastAsia="Arial" w:hAnsi="Arial"/>
+        </w:rPr>
+        <w:t xml:space="preserve">). Promotion updates what’s served; the agent picks it up. Rollback serves the prior version. No redeploy.</w:t>
+      </w:r>
+    </w:p>
+    <w:p>
+      <w:pPr>
+        <w:spacing w:after="120" w:line="276"/>
+      </w:pPr>
+      <w:r>
+        <w:rPr>
+          <w:color w:val="8A8A95"/>
+          <w:sz w:val="19"/>
+          <w:szCs w:val="19"/>
+          <w:rFonts w:ascii="Arial" w:cs="Arial" w:eastAsia="Arial" w:hAnsi="Arial"/>
+        </w:rPr>
+        <w:t xml:space="preserve">Initial G0 = the customer registers their current system prompt (aprntc needs only the prompt text, not the code); if they don’t, aprntc infers an approximate G0 from the system prompt the tap observed.</w:t>
+      </w:r>
+    </w:p>
+    <w:p>
+      <w:pPr>
+        <w:pStyle w:val="Heading2"/>
+      </w:pPr>
+      <w:r>
+        <w:rPr>
+          <w:rFonts w:ascii="Arial" w:cs="Arial" w:eastAsia="Arial" w:hAnsi="Arial"/>
+        </w:rPr>
+        <w:t xml:space="preserve">Tap boundaries — which collector, which scenario</w:t>
+      </w:r>
+    </w:p>
+    <w:p>
+      <w:pPr>
+        <w:spacing w:after="120" w:line="276"/>
+      </w:pPr>
+      <w:r>
+        <w:rPr>
+          <w:color w:val="1A1A22"/>
+          <w:sz w:val="21"/>
+          <w:szCs w:val="21"/>
+          <w:rFonts w:ascii="Arial" w:cs="Arial" w:eastAsia="Arial" w:hAnsi="Arial"/>
+        </w:rPr>
+        <w:t xml:space="preserve">The inbound tap isn’t one integration; it’s a set of </w:t>
+      </w:r>
+      <w:r>
+        <w:rPr>
+          <w:b/>
+          <w:bCs/>
+          <w:color w:val="1A1A22"/>
+          <w:sz w:val="21"/>
+          <w:szCs w:val="21"/>
+          <w:rFonts w:ascii="Arial" w:cs="Arial" w:eastAsia="Arial" w:hAnsi="Arial"/>
+        </w:rPr>
+        <w:t xml:space="preserve">collectors at stable protocol boundaries</w:t>
+      </w:r>
+      <w:r>
+        <w:rPr>
+          <w:color w:val="1A1A22"/>
+          <w:sz w:val="21"/>
+          <w:szCs w:val="21"/>
+          <w:rFonts w:ascii="Arial" w:cs="Arial" w:eastAsia="Arial" w:hAnsi="Arial"/>
+        </w:rPr>
+        <w:t xml:space="preserve">. You attach at whichever boundary your agent already exposes — no framework lock-in. Each collector normalizes into the </w:t>
+      </w:r>
+      <w:r>
+        <w:rPr>
+          <w:i/>
+          <w:iCs/>
+          <w:color w:val="1A1A22"/>
+          <w:sz w:val="21"/>
+          <w:szCs w:val="21"/>
+          <w:rFonts w:ascii="Arial" w:cs="Arial" w:eastAsia="Arial" w:hAnsi="Arial"/>
+        </w:rPr>
+        <w:t xml:space="preserve">same</w:t>
+      </w:r>
+      <w:r>
+        <w:rPr>
+          <w:color w:val="1A1A22"/>
+          <w:sz w:val="21"/>
+          <w:szCs w:val="21"/>
+          <w:rFonts w:ascii="Arial" w:cs="Arial" w:eastAsia="Arial" w:hAnsi="Arial"/>
+        </w:rPr>
+        <w:t xml:space="preserve"> canonical Trajectory, and fidelity degrades gracefully by how the target was built: an agent we own gives full tool tracking; a closed-source agent behind the proxy still gives us model traffic.</w:t>
       </w:r>
     </w:p>
     <w:p>
@@ -1443,9 +1625,9 @@
       <w:r>
         <w:drawing>
           <wp:inline distT="0" distB="0" distL="0" distR="0">
-            <wp:extent cx="5943600" cy="3629025"/>
+            <wp:extent cx="6172200" cy="3686175"/>
             <wp:effectExtent t="0" r="0" b="0" l="0"/>
-            <wp:docPr id="1" name="fig3-production.png" descr="Figure 3 — aprntc observes via a read-only tap (inbound) and serves the improved playbook the agent pulls (outbound). The gated config swap is the only write back to production." title="Figure 3 — aprntc observes via a read-only tap (inbound) and"/>
+            <wp:docPr id="1" name="fig4-taps.png" descr="Figure 3 — The four tap boundaries, the collector at each, the scenario it fits, and how complete its tool-call capture is. A2A is the deferred fifth boundary." title="Figure 3 — The four tap boundaries, the collector at each, t"/>
             <wp:cNvGraphicFramePr>
               <a:graphicFrameLocks xmlns:a="http://schemas.openxmlformats.org/drawingml/2006/main" noChangeAspect="1"/>
             </wp:cNvGraphicFramePr>
@@ -1468,251 +1650,6 @@
                   <pic:spPr bwMode="auto">
                     <a:xfrm>
                       <a:off x="0" y="0"/>
-                      <a:ext cx="5943600" cy="3629025"/>
-                    </a:xfrm>
-                    <a:prstGeom prst="rect">
-                      <a:avLst/>
-                    </a:prstGeom>
-                  </pic:spPr>
-                </pic:pic>
-              </a:graphicData>
-            </a:graphic>
-          </wp:inline>
-        </w:drawing>
-      </w:r>
-    </w:p>
-    <w:p>
-      <w:pPr>
-        <w:spacing w:after="200"/>
-        <w:jc w:val="center"/>
-      </w:pPr>
-      <w:r>
-        <w:rPr>
-          <w:i/>
-          <w:iCs/>
-          <w:color w:val="8A8A95"/>
-          <w:sz w:val="17"/>
-          <w:szCs w:val="17"/>
-          <w:rFonts w:ascii="Arial" w:cs="Arial" w:eastAsia="Arial" w:hAnsi="Arial"/>
-        </w:rPr>
-        <w:t xml:space="preserve">Figure 3 — aprntc observes via a read-only tap (inbound) and serves the improved playbook the agent pulls (outbound). The gated config swap is the only write back to production.</w:t>
-      </w:r>
-    </w:p>
-    <w:p>
-      <w:pPr>
-        <w:pStyle w:val="Heading2"/>
-      </w:pPr>
-      <w:r>
-        <w:rPr>
-          <w:rFonts w:ascii="Arial" w:cs="Arial" w:eastAsia="Arial" w:hAnsi="Arial"/>
-        </w:rPr>
-        <w:t xml:space="preserve">Connecting an external agent</w:t>
-      </w:r>
-    </w:p>
-    <w:p>
-      <w:pPr>
-        <w:spacing w:after="120" w:line="276"/>
-      </w:pPr>
-      <w:r>
-        <w:rPr>
-          <w:color w:val="1A1A22"/>
-          <w:sz w:val="21"/>
-          <w:szCs w:val="21"/>
-          <w:rFonts w:ascii="Arial" w:cs="Arial" w:eastAsia="Arial" w:hAnsi="Arial"/>
-        </w:rPr>
-        <w:t xml:space="preserve">aprntc owns neither the agent’s code nor its prompt, so the Playbook becomes a contract with two halves:</w:t>
-      </w:r>
-    </w:p>
-    <w:p>
-      <w:pPr>
-        <w:pStyle w:val="ListParagraph"/>
-        <w:numPr>
-          <w:ilvl w:val="0"/>
-          <w:numId w:val="2"/>
-        </w:numPr>
-        <w:spacing w:after="60" w:line="264"/>
-      </w:pPr>
-      <w:r>
-        <w:rPr>
-          <w:b/>
-          <w:bCs/>
-          <w:color w:val="1A1A22"/>
-          <w:sz w:val="21"/>
-          <w:szCs w:val="21"/>
-          <w:rFonts w:ascii="Arial" w:cs="Arial" w:eastAsia="Arial" w:hAnsi="Arial"/>
-        </w:rPr>
-        <w:t xml:space="preserve">Inbound (observe).  </w:t>
-      </w:r>
-      <w:r>
-        <w:rPr>
-          <w:color w:val="1A1A22"/>
-          <w:sz w:val="21"/>
-          <w:szCs w:val="21"/>
-          <w:rFonts w:ascii="Arial" w:cs="Arial" w:eastAsia="Arial" w:hAnsi="Arial"/>
-        </w:rPr>
-        <w:t xml:space="preserve">The agent’s traffic flows into aprntc via a tap (egress proxy / OpenTelemetry / MCP gateway). Read-only. This is how aprntc sees behavior without owning the code.</w:t>
-      </w:r>
-    </w:p>
-    <w:p>
-      <w:pPr>
-        <w:pStyle w:val="ListParagraph"/>
-        <w:numPr>
-          <w:ilvl w:val="0"/>
-          <w:numId w:val="2"/>
-        </w:numPr>
-        <w:spacing w:after="60" w:line="264"/>
-      </w:pPr>
-      <w:r>
-        <w:rPr>
-          <w:b/>
-          <w:bCs/>
-          <w:color w:val="1A1A22"/>
-          <w:sz w:val="21"/>
-          <w:szCs w:val="21"/>
-          <w:rFonts w:ascii="Arial" w:cs="Arial" w:eastAsia="Arial" w:hAnsi="Arial"/>
-        </w:rPr>
-        <w:t xml:space="preserve">Outbound (control).  </w:t>
-      </w:r>
-      <w:r>
-        <w:rPr>
-          <w:color w:val="1A1A22"/>
-          <w:sz w:val="21"/>
-          <w:szCs w:val="21"/>
-          <w:rFonts w:ascii="Arial" w:cs="Arial" w:eastAsia="Arial" w:hAnsi="Arial"/>
-        </w:rPr>
-        <w:t xml:space="preserve">The agent pulls its active playbook from aprntc’s config-fetch API (</w:t>
-      </w:r>
-      <w:r>
-        <w:rPr>
-          <w:color w:val="33336A"/>
-          <w:sz w:val="19"/>
-          <w:szCs w:val="19"/>
-          <w:rFonts w:ascii="Consolas" w:cs="Consolas" w:eastAsia="Consolas" w:hAnsi="Consolas"/>
-        </w:rPr>
-        <w:t xml:space="preserve">GET /api/playbooks/{id}/active</w:t>
-      </w:r>
-      <w:r>
-        <w:rPr>
-          <w:color w:val="1A1A22"/>
-          <w:sz w:val="21"/>
-          <w:szCs w:val="21"/>
-          <w:rFonts w:ascii="Arial" w:cs="Arial" w:eastAsia="Arial" w:hAnsi="Arial"/>
-        </w:rPr>
-        <w:t xml:space="preserve">). Promotion updates what’s served; the agent picks it up. Rollback serves the prior version. No redeploy.</w:t>
-      </w:r>
-    </w:p>
-    <w:p>
-      <w:pPr>
-        <w:spacing w:after="120" w:line="276"/>
-      </w:pPr>
-      <w:r>
-        <w:rPr>
-          <w:color w:val="8A8A95"/>
-          <w:sz w:val="19"/>
-          <w:szCs w:val="19"/>
-          <w:rFonts w:ascii="Arial" w:cs="Arial" w:eastAsia="Arial" w:hAnsi="Arial"/>
-        </w:rPr>
-        <w:t xml:space="preserve">Initial G0 = the customer registers their current system prompt (aprntc needs only the prompt text, not the code); if they don’t, aprntc infers an approximate G0 from the system prompt the tap observed.</w:t>
-      </w:r>
-    </w:p>
-    <w:p>
-      <w:pPr>
-        <w:pStyle w:val="Heading2"/>
-      </w:pPr>
-      <w:r>
-        <w:rPr>
-          <w:rFonts w:ascii="Arial" w:cs="Arial" w:eastAsia="Arial" w:hAnsi="Arial"/>
-        </w:rPr>
-        <w:t xml:space="preserve">Tap boundaries — which collector, which scenario</w:t>
-      </w:r>
-    </w:p>
-    <w:p>
-      <w:pPr>
-        <w:spacing w:after="120" w:line="276"/>
-      </w:pPr>
-      <w:r>
-        <w:rPr>
-          <w:color w:val="1A1A22"/>
-          <w:sz w:val="21"/>
-          <w:szCs w:val="21"/>
-          <w:rFonts w:ascii="Arial" w:cs="Arial" w:eastAsia="Arial" w:hAnsi="Arial"/>
-        </w:rPr>
-        <w:t xml:space="preserve">The inbound tap isn’t one integration; it’s a set of </w:t>
-      </w:r>
-      <w:r>
-        <w:rPr>
-          <w:b/>
-          <w:bCs/>
-          <w:color w:val="1A1A22"/>
-          <w:sz w:val="21"/>
-          <w:szCs w:val="21"/>
-          <w:rFonts w:ascii="Arial" w:cs="Arial" w:eastAsia="Arial" w:hAnsi="Arial"/>
-        </w:rPr>
-        <w:t xml:space="preserve">collectors at stable protocol boundaries</w:t>
-      </w:r>
-      <w:r>
-        <w:rPr>
-          <w:color w:val="1A1A22"/>
-          <w:sz w:val="21"/>
-          <w:szCs w:val="21"/>
-          <w:rFonts w:ascii="Arial" w:cs="Arial" w:eastAsia="Arial" w:hAnsi="Arial"/>
-        </w:rPr>
-        <w:t xml:space="preserve">. You attach at whichever boundary your agent already exposes — no framework lock-in. Each collector normalizes into the </w:t>
-      </w:r>
-      <w:r>
-        <w:rPr>
-          <w:i/>
-          <w:iCs/>
-          <w:color w:val="1A1A22"/>
-          <w:sz w:val="21"/>
-          <w:szCs w:val="21"/>
-          <w:rFonts w:ascii="Arial" w:cs="Arial" w:eastAsia="Arial" w:hAnsi="Arial"/>
-        </w:rPr>
-        <w:t xml:space="preserve">same</w:t>
-      </w:r>
-      <w:r>
-        <w:rPr>
-          <w:color w:val="1A1A22"/>
-          <w:sz w:val="21"/>
-          <w:szCs w:val="21"/>
-          <w:rFonts w:ascii="Arial" w:cs="Arial" w:eastAsia="Arial" w:hAnsi="Arial"/>
-        </w:rPr>
-        <w:t xml:space="preserve"> canonical Trajectory, and fidelity degrades gracefully by how the target was built: an agent we own gives full tool tracking; a closed-source agent behind the proxy still gives us model traffic.</w:t>
-      </w:r>
-    </w:p>
-    <w:p>
-      <w:pPr>
-        <w:spacing w:before="120" w:after="60"/>
-        <w:jc w:val="center"/>
-      </w:pPr>
-      <w:r>
-        <w:drawing>
-          <wp:inline distT="0" distB="0" distL="0" distR="0">
-            <wp:extent cx="6172200" cy="3686175"/>
-            <wp:effectExtent t="0" r="0" b="0" l="0"/>
-            <wp:docPr id="1" name="fig4-taps.png" descr="Figure 4 — The four tap boundaries, the collector at each, the scenario it fits, and how complete its tool-call capture is. A2A is the deferred fifth boundary." title="Figure 4 — The four tap boundaries, the collector at each, t"/>
-            <wp:cNvGraphicFramePr>
-              <a:graphicFrameLocks xmlns:a="http://schemas.openxmlformats.org/drawingml/2006/main" noChangeAspect="1"/>
-            </wp:cNvGraphicFramePr>
-            <a:graphic xmlns:a="http://schemas.openxmlformats.org/drawingml/2006/main">
-              <a:graphicData uri="http://schemas.openxmlformats.org/drawingml/2006/picture">
-                <pic:pic xmlns:pic="http://schemas.openxmlformats.org/drawingml/2006/picture">
-                  <pic:nvPicPr>
-                    <pic:cNvPr id="0" name="" descr=""/>
-                    <pic:cNvPicPr>
-                      <a:picLocks noChangeAspect="1" noChangeArrowheads="1"/>
-                    </pic:cNvPicPr>
-                  </pic:nvPicPr>
-                  <pic:blipFill>
-                    <a:blip r:embed="rId10" cstate="none"/>
-                    <a:srcRect/>
-                    <a:stretch>
-                      <a:fillRect/>
-                    </a:stretch>
-                  </pic:blipFill>
-                  <pic:spPr bwMode="auto">
-                    <a:xfrm>
-                      <a:off x="0" y="0"/>
                       <a:ext cx="6172200" cy="3686175"/>
                     </a:xfrm>
                     <a:prstGeom prst="rect">
@@ -1740,7 +1677,7 @@
           <w:szCs w:val="17"/>
           <w:rFonts w:ascii="Arial" w:cs="Arial" w:eastAsia="Arial" w:hAnsi="Arial"/>
         </w:rPr>
-        <w:t xml:space="preserve">Figure 4 — The four tap boundaries, the collector at each, the scenario it fits, and how complete its tool-call capture is. A2A is the deferred fifth boundary.</w:t>
+        <w:t xml:space="preserve">Figure 3 — The four tap boundaries, the collector at each, the scenario it fits, and how complete its tool-call capture is. A2A is the deferred fifth boundary.</w:t>
       </w:r>
     </w:p>
     <w:tbl>

</xml_diff>

<commit_message>
feat(tap): add A2A interceptor collector (agent boundary)
Adds the fifth tap collector, completing all four protocol boundaries.
The A2A interceptor maps an Agent-to-Agent Task -> one canonical Episode
with a single HANDOFF step at SourceFidelity.COARSE (task/artifact
granularity; the remote agent's internal tool calls aren't visible to the
caller). Like the other external collectors it's a pure dict-in/Episode-out
normalizer with no hard A2A dependency, tolerant of A2A field-name variants;
failed tasks record their error.

- schema: Collector.A2A + SourceFidelity.COARSE
- tap/a2a_ingest.py + wired into tap/__init__.py; [a2a] extra in pyproject
- 7 new tests (295 passing, was 288)
- reconcile docs that marked A2A deferred: tap README, ADR 0004, DESIGN,
  DESIGN_AND_SOLUTION, and the design doc HTML + Word (Figure 4 + tables
  now show A2A active, COARSE)

Co-Authored-By: Claude Opus 4.8 <noreply@anthropic.com>
</commit_message>
<xml_diff>
--- a/docs/design/aprntc-design.docx
+++ b/docs/design/aprntc-design.docx
@@ -70,7 +70,7 @@
           <w:szCs w:val="20"/>
           <w:rFonts w:ascii="Arial" w:cs="Arial" w:eastAsia="Arial" w:hAnsi="Arial"/>
         </w:rPr>
-        <w:t xml:space="preserve">Status:  Feature-complete · 288 tests passing</w:t>
+        <w:t xml:space="preserve">Status:  Feature-complete · 295 tests passing</w:t>
       </w:r>
     </w:p>
     <w:p>
@@ -1487,7 +1487,7 @@
           <w:szCs w:val="21"/>
           <w:rFonts w:ascii="Arial" w:cs="Arial" w:eastAsia="Arial" w:hAnsi="Arial"/>
         </w:rPr>
-        <w:t xml:space="preserve">The agent’s traffic flows into aprntc via a tap (egress proxy / OpenTelemetry / MCP gateway). Read-only. This is how aprntc sees behavior without owning the code.</w:t>
+        <w:t xml:space="preserve">The agent’s traffic flows into aprntc via a tap (egress proxy / OpenTelemetry / MCP gateway / A2A). Read-only. This is how aprntc sees behavior without owning the code.</w:t>
       </w:r>
     </w:p>
     <w:p>
@@ -1627,7 +1627,7 @@
           <wp:inline distT="0" distB="0" distL="0" distR="0">
             <wp:extent cx="6172200" cy="3686175"/>
             <wp:effectExtent t="0" r="0" b="0" l="0"/>
-            <wp:docPr id="1" name="fig4-taps.png" descr="Figure 3 — The four tap boundaries, the collector at each, the scenario it fits, and how complete its tool-call capture is. A2A is the deferred fifth boundary." title="Figure 3 — The four tap boundaries, the collector at each, t"/>
+            <wp:docPr id="1" name="fig4-taps.png" descr="Figure 3 — The four tap boundaries and five collectors, the scenario each fits, and how complete its tool-call capture is. All four boundaries — including the agent-to-agent (A2A) layer — are instrumented." title="Figure 3 — The four tap boundaries and five collectors, the "/>
             <wp:cNvGraphicFramePr>
               <a:graphicFrameLocks xmlns:a="http://schemas.openxmlformats.org/drawingml/2006/main" noChangeAspect="1"/>
             </wp:cNvGraphicFramePr>
@@ -1677,7 +1677,7 @@
           <w:szCs w:val="17"/>
           <w:rFonts w:ascii="Arial" w:cs="Arial" w:eastAsia="Arial" w:hAnsi="Arial"/>
         </w:rPr>
-        <w:t xml:space="preserve">Figure 3 — The four tap boundaries, the collector at each, the scenario it fits, and how complete its tool-call capture is. A2A is the deferred fifth boundary.</w:t>
+        <w:t xml:space="preserve">Figure 3 — The four tap boundaries and five collectors, the scenario each fits, and how complete its tool-call capture is. All four boundaries — including the agent-to-agent (A2A) layer — are instrumented.</w:t>
       </w:r>
     </w:p>
     <w:tbl>
@@ -2471,7 +2471,7 @@
                 <w:szCs w:val="18"/>
                 <w:rFonts w:ascii="Arial" w:cs="Arial" w:eastAsia="Arial" w:hAnsi="Arial"/>
               </w:rPr>
-              <w:t xml:space="preserve">Agents exposed over A2A. Coarsest granularity.</w:t>
+              <w:t xml:space="preserve">Multi-agent systems over A2A; task/artifact-grained capture.</w:t>
             </w:r>
           </w:p>
         </w:tc>
@@ -2504,7 +2504,7 @@
                 <w:szCs w:val="18"/>
                 <w:rFonts w:ascii="Arial" w:cs="Arial" w:eastAsia="Arial" w:hAnsi="Arial"/>
               </w:rPr>
-              <w:t xml:space="preserve">Deferred (post-v1)</w:t>
+              <w:t xml:space="preserve">Coarse</w:t>
             </w:r>
           </w:p>
         </w:tc>
@@ -2847,7 +2847,7 @@
                 <w:szCs w:val="18"/>
                 <w:rFonts w:ascii="Arial" w:cs="Arial" w:eastAsia="Arial" w:hAnsi="Arial"/>
               </w:rPr>
-              <w:t xml:space="preserve">SDK wrapper (full fidelity) · LiteLLM egress proxy · OTel ingester · MCP gateway — all normalize into one Trajectory; async + fail-open.</w:t>
+              <w:t xml:space="preserve">SDK wrapper (full fidelity) · LiteLLM egress proxy · OTel ingester · MCP gateway · A2A interceptor — all normalize into one Trajectory; async + fail-open.</w:t>
             </w:r>
           </w:p>
         </w:tc>
@@ -5282,7 +5282,7 @@
                 <w:szCs w:val="18"/>
                 <w:rFonts w:ascii="Arial" w:cs="Arial" w:eastAsia="Arial" w:hAnsi="Arial"/>
               </w:rPr>
-              <w:t xml:space="preserve">Tap = protocol-boundary collectors, wrapping OSS.</w:t>
+              <w:t xml:space="preserve">Tap = protocol-boundary collectors, wrapping OSS (SDK · proxy · OTel · MCP · A2A).</w:t>
             </w:r>
           </w:p>
         </w:tc>
@@ -5794,7 +5794,7 @@
           <w:szCs w:val="21"/>
           <w:rFonts w:ascii="Arial" w:cs="Arial" w:eastAsia="Arial" w:hAnsi="Arial"/>
         </w:rPr>
-        <w:t xml:space="preserve">— distillation quality, real BytePlus support agent, external collectors (proxy/OTel/MCP), online shadow + canary, learned fusion weights, auto-promotion, multi-agent fleets. (Fine-tuning parked — open-weight models only.)</w:t>
+        <w:t xml:space="preserve">— distillation quality, real BytePlus support agent, external collectors (proxy/OTel/MCP/A2A), online shadow + canary, learned fusion weights, auto-promotion, multi-agent fleets. (Fine-tuning parked — open-weight models only.)</w:t>
       </w:r>
     </w:p>
     <w:p>
@@ -5845,16 +5845,16 @@
           <w:szCs w:val="21"/>
           <w:rFonts w:ascii="Arial" w:cs="Arial" w:eastAsia="Arial" w:hAnsi="Arial"/>
         </w:rPr>
-        <w:t xml:space="preserve">288 tests passing.  </w:t>
-      </w:r>
-      <w:r>
-        <w:rPr>
-          <w:color w:val="1A1A22"/>
-          <w:sz w:val="21"/>
-          <w:szCs w:val="21"/>
-          <w:rFonts w:ascii="Arial" w:cs="Arial" w:eastAsia="Arial" w:hAnsi="Arial"/>
-        </w:rPr>
-        <w:t xml:space="preserve">Docs: DESIGN_AND_SOLUTION, PRODUCTION, DEPLOY, ROADMAP, STATUS, 8 ADRs.</w:t>
+        <w:t xml:space="preserve">295 tests passing.  </w:t>
+      </w:r>
+      <w:r>
+        <w:rPr>
+          <w:color w:val="1A1A22"/>
+          <w:sz w:val="21"/>
+          <w:szCs w:val="21"/>
+          <w:rFonts w:ascii="Arial" w:cs="Arial" w:eastAsia="Arial" w:hAnsi="Arial"/>
+        </w:rPr>
+        <w:t xml:space="preserve">Docs: DESIGN_AND_SOLUTION, PRODUCTION, DEPLOY, ROADMAP, STATUS, 8 ADRs, technical report (docs/research).</w:t>
       </w:r>
     </w:p>
     <w:p>

</xml_diff>